<commit_message>
Before Lunch break button functionality
</commit_message>
<xml_diff>
--- a/presentation.docx
+++ b/presentation.docx
@@ -4,7 +4,7 @@
   <w:body>
     <w:p>
       <w:pPr>
-        <w:pStyle w:val="823"/>
+        <w:pStyle w:val="837"/>
         <w:pBdr/>
         <w:spacing/>
         <w:ind/>
@@ -14,12 +14,6 @@
         <w:t xml:space="preserve">Zeitstempel Stephansdom</w:t>
       </w:r>
       <w:r/>
-      <w:r/>
-      <w:r/>
-      <w:r/>
-      <w:r/>
-      <w:r/>
-      <w:r/>
     </w:p>
     <w:p>
       <w:pPr>
@@ -34,19 +28,20 @@
         </w:rPr>
       </w:pPr>
       <w:r>
-        <w:rPr>
-          <w:lang w:val="undefined"/>
-        </w:rPr>
         <w:t xml:space="preserve">Eigenen Server mieten? Domain Name egal?</w:t>
       </w:r>
       <w:r>
         <w:tab/>
       </w:r>
-      <w:r/>
+      <w:r>
+        <w:rPr>
+          <w:highlight w:val="none"/>
+        </w:rPr>
+      </w:r>
     </w:p>
     <w:p>
       <w:pPr>
-        <w:pStyle w:val="885"/>
+        <w:pStyle w:val="899"/>
         <w:numPr>
           <w:ilvl w:val="0"/>
           <w:numId w:val="2"/>
@@ -59,13 +54,11 @@
         <w:ind/>
         <w:rPr>
           <w:highlight w:val="none"/>
-          <w:lang w:val="undefined"/>
         </w:rPr>
       </w:pPr>
       <w:r>
         <w:rPr>
           <w:highlight w:val="none"/>
-          <w:lang w:val="undefined"/>
         </w:rPr>
         <w:t xml:space="preserve">Ja Hetzner; Domain-Name: noch nicht ausgesucht. (wird random sein; aber app-name noch auswählbar)</w:t>
       </w:r>
@@ -74,34 +67,41 @@
           <w:highlight w:val="none"/>
         </w:rPr>
       </w:r>
-    </w:p>
-    <w:p>
-      <w:pPr>
-        <w:pBdr/>
-        <w:spacing/>
-        <w:ind/>
-        <w:rPr>
-          <w:highlight w:val="none"/>
-          <w:lang w:val="undefined"/>
-        </w:rPr>
-      </w:pPr>
       <w:r>
         <w:rPr>
           <w:highlight w:val="none"/>
-          <w:lang w:val="undefined"/>
+        </w:rPr>
+      </w:r>
+    </w:p>
+    <w:p>
+      <w:pPr>
+        <w:pBdr/>
+        <w:spacing/>
+        <w:ind/>
+        <w:rPr>
+          <w:highlight w:val="none"/>
+        </w:rPr>
+      </w:pPr>
+      <w:r>
+        <w:rPr>
+          <w:highlight w:val="none"/>
         </w:rPr>
         <w:t xml:space="preserve">Verhindern, dass jemand von zu Hause aus einstempelt:</w:t>
       </w:r>
       <w:r>
         <w:rPr>
           <w:highlight w:val="none"/>
-          <w:lang w:val="undefined"/>
+        </w:rPr>
+      </w:r>
+      <w:r>
+        <w:rPr>
+          <w:highlight w:val="none"/>
         </w:rPr>
       </w:r>
     </w:p>
     <w:p>
       <w:pPr>
-        <w:pStyle w:val="885"/>
+        <w:pStyle w:val="899"/>
         <w:numPr>
           <w:ilvl w:val="0"/>
           <w:numId w:val="1"/>
@@ -114,16 +114,15 @@
       <w:r>
         <w:rPr>
           <w:highlight w:val="none"/>
-          <w:lang w:val="undefined"/>
         </w:rPr>
         <w:t xml:space="preserve">WLAN-access (IP Adress limiting) only</w:t>
       </w:r>
       <w:r>
         <w:rPr>
           <w:highlight w:val="none"/>
-          <w:lang w:val="undefined"/>
         </w:rPr>
       </w:r>
+      <w:r/>
     </w:p>
     <w:p>
       <w:pPr>
@@ -132,63 +131,34 @@
         <w:ind w:firstLine="0" w:left="0"/>
         <w:rPr>
           <w:highlight w:val="none"/>
-          <w:lang w:val="undefined"/>
         </w:rPr>
       </w:pPr>
       <w:r>
         <w:rPr>
           <w:highlight w:val="none"/>
-          <w:lang w:val="undefined"/>
         </w:rPr>
         <w:t xml:space="preserve">Gibt es eine Datenbank mit Nutzern/ sollen Nutzer neue Accounts anlegen?</w:t>
       </w:r>
       <w:r>
         <w:rPr>
           <w:highlight w:val="none"/>
-          <w:lang w:val="undefined"/>
-        </w:rPr>
-      </w:r>
-      <w:r>
-        <w:rPr>
-          <w:highlight w:val="none"/>
-          <w:lang w:val="undefined"/>
-        </w:rPr>
-      </w:r>
-      <w:r>
-        <w:rPr>
-          <w:highlight w:val="none"/>
-          <w:lang w:val="undefined"/>
         </w:rPr>
         <w:t xml:space="preserve"> Nein</w:t>
       </w:r>
       <w:r>
         <w:rPr>
           <w:highlight w:val="none"/>
-          <w:lang w:val="undefined"/>
         </w:rPr>
       </w:r>
       <w:r>
         <w:rPr>
           <w:highlight w:val="none"/>
-          <w:lang w:val="undefined"/>
-        </w:rPr>
-      </w:r>
-      <w:r>
-        <w:rPr>
-          <w:highlight w:val="none"/>
-          <w:lang w:val="undefined"/>
-        </w:rPr>
-      </w:r>
-      <w:r>
-        <w:rPr>
-          <w:highlight w:val="none"/>
-          <w:lang w:val="undefined"/>
         </w:rPr>
       </w:r>
     </w:p>
     <w:p>
       <w:pPr>
-        <w:pStyle w:val="885"/>
+        <w:pStyle w:val="899"/>
         <w:numPr>
           <w:ilvl w:val="0"/>
           <w:numId w:val="7"/>
@@ -198,20 +168,22 @@
         <w:ind/>
         <w:rPr>
           <w:highlight w:val="none"/>
-          <w:lang w:val="undefined"/>
         </w:rPr>
       </w:pPr>
       <w:r>
         <w:rPr>
           <w:highlight w:val="none"/>
-          <w:lang w:val="undefined"/>
         </w:rPr>
         <w:t xml:space="preserve">Werden dann manuell eingespeist.</w:t>
       </w:r>
       <w:r>
         <w:rPr>
           <w:highlight w:val="none"/>
-          <w:lang w:val="undefined"/>
+        </w:rPr>
+      </w:r>
+      <w:r>
+        <w:rPr>
+          <w:highlight w:val="none"/>
         </w:rPr>
       </w:r>
     </w:p>
@@ -222,44 +194,46 @@
         <w:ind/>
         <w:rPr>
           <w:highlight w:val="none"/>
-          <w:lang w:val="undefined"/>
         </w:rPr>
       </w:pPr>
       <w:r>
-        <w:rPr>
-          <w:lang w:val="undefined"/>
-        </w:rPr>
         <w:t xml:space="preserve">TODO:</w:t>
       </w:r>
-      <w:r/>
-    </w:p>
-    <w:p>
-      <w:pPr>
-        <w:pBdr/>
-        <w:spacing/>
-        <w:ind/>
-        <w:rPr>
-          <w:highlight w:val="none"/>
-          <w:lang w:val="undefined"/>
-        </w:rPr>
-      </w:pPr>
       <w:r>
         <w:rPr>
           <w:highlight w:val="none"/>
-          <w:lang w:val="undefined"/>
+        </w:rPr>
+      </w:r>
+    </w:p>
+    <w:p>
+      <w:pPr>
+        <w:pBdr/>
+        <w:spacing/>
+        <w:ind/>
+        <w:rPr>
+          <w:highlight w:val="none"/>
+        </w:rPr>
+      </w:pPr>
+      <w:r>
+        <w:rPr>
+          <w:highlight w:val="none"/>
         </w:rPr>
         <w:t xml:space="preserve">Allgemein:</w:t>
       </w:r>
       <w:r>
         <w:rPr>
           <w:highlight w:val="none"/>
-          <w:lang w:val="undefined"/>
+        </w:rPr>
+      </w:r>
+      <w:r>
+        <w:rPr>
+          <w:highlight w:val="none"/>
         </w:rPr>
       </w:r>
     </w:p>
     <w:p>
       <w:pPr>
-        <w:pStyle w:val="885"/>
+        <w:pStyle w:val="899"/>
         <w:numPr>
           <w:ilvl w:val="0"/>
           <w:numId w:val="6"/>
@@ -274,7 +248,6 @@
       <w:r>
         <w:rPr>
           <w:highlight w:val="none"/>
-          <w:lang w:val="undefined"/>
         </w:rPr>
       </w:r>
       <w:r>
@@ -288,10 +261,15 @@
           <w:highlight w:val="none"/>
         </w:rPr>
       </w:r>
+      <w:r>
+        <w:rPr>
+          <w:highlight w:val="none"/>
+        </w:rPr>
+      </w:r>
     </w:p>
     <w:p>
       <w:pPr>
-        <w:pStyle w:val="885"/>
+        <w:pStyle w:val="899"/>
         <w:numPr>
           <w:ilvl w:val="0"/>
           <w:numId w:val="6"/>
@@ -319,10 +297,15 @@
           <w:highlight w:val="none"/>
         </w:rPr>
       </w:r>
+      <w:r>
+        <w:rPr>
+          <w:highlight w:val="none"/>
+        </w:rPr>
+      </w:r>
     </w:p>
     <w:p>
       <w:pPr>
-        <w:pStyle w:val="885"/>
+        <w:pStyle w:val="899"/>
         <w:numPr>
           <w:ilvl w:val="0"/>
           <w:numId w:val="6"/>
@@ -350,10 +333,15 @@
           <w:highlight w:val="none"/>
         </w:rPr>
       </w:r>
+      <w:r>
+        <w:rPr>
+          <w:highlight w:val="none"/>
+        </w:rPr>
+      </w:r>
     </w:p>
     <w:p>
       <w:pPr>
-        <w:pStyle w:val="885"/>
+        <w:pStyle w:val="899"/>
         <w:numPr>
           <w:ilvl w:val="0"/>
           <w:numId w:val="6"/>
@@ -381,10 +369,15 @@
           <w:highlight w:val="none"/>
         </w:rPr>
       </w:r>
+      <w:r>
+        <w:rPr>
+          <w:highlight w:val="none"/>
+        </w:rPr>
+      </w:r>
     </w:p>
     <w:p>
       <w:pPr>
-        <w:pStyle w:val="885"/>
+        <w:pStyle w:val="899"/>
         <w:numPr>
           <w:ilvl w:val="0"/>
           <w:numId w:val="6"/>
@@ -412,17 +405,30 @@
           <w:highlight w:val="none"/>
         </w:rPr>
       </w:r>
-      <w:r/>
       <w:r>
         <w:rPr>
           <w:highlight w:val="none"/>
-          <w:lang w:val="undefined"/>
         </w:rPr>
+      </w:r>
+    </w:p>
+    <w:p>
+      <w:pPr>
+        <w:pBdr/>
+        <w:spacing/>
+        <w:ind/>
+        <w:rPr>
+          <w:highlight w:val="none"/>
+        </w:rPr>
+      </w:pPr>
+      <w:r>
+        <w:rPr>
+          <w:highlight w:val="none"/>
+        </w:rPr>
+        <w:t xml:space="preserve">Extra Funktion für User:</w:t>
       </w:r>
       <w:r>
         <w:rPr>
           <w:highlight w:val="none"/>
-          <w:lang w:val="undefined"/>
         </w:rPr>
       </w:r>
       <w:r>
@@ -433,31 +439,7 @@
     </w:p>
     <w:p>
       <w:pPr>
-        <w:pBdr/>
-        <w:spacing/>
-        <w:ind/>
-        <w:rPr>
-          <w:highlight w:val="none"/>
-          <w:lang w:val="undefined"/>
-        </w:rPr>
-      </w:pPr>
-      <w:r>
-        <w:rPr>
-          <w:highlight w:val="none"/>
-          <w:lang w:val="undefined"/>
-        </w:rPr>
-        <w:t xml:space="preserve">Extra Funktion für User:</w:t>
-      </w:r>
-      <w:r>
-        <w:rPr>
-          <w:highlight w:val="none"/>
-          <w:lang w:val="undefined"/>
-        </w:rPr>
-      </w:r>
-    </w:p>
-    <w:p>
-      <w:pPr>
-        <w:pStyle w:val="885"/>
+        <w:pStyle w:val="899"/>
         <w:numPr>
           <w:ilvl w:val="0"/>
           <w:numId w:val="3"/>
@@ -467,26 +449,28 @@
         <w:ind/>
         <w:rPr>
           <w:highlight w:val="none"/>
-          <w:lang w:val="undefined"/>
         </w:rPr>
       </w:pPr>
       <w:r>
         <w:rPr>
           <w:highlight w:val="none"/>
-          <w:lang w:val="undefined"/>
         </w:rPr>
         <w:t xml:space="preserve">Krankenstand melden</w:t>
       </w:r>
       <w:r>
         <w:rPr>
           <w:highlight w:val="none"/>
-          <w:lang w:val="undefined"/>
+        </w:rPr>
+      </w:r>
+      <w:r>
+        <w:rPr>
+          <w:highlight w:val="none"/>
         </w:rPr>
       </w:r>
     </w:p>
     <w:p>
       <w:pPr>
-        <w:pStyle w:val="885"/>
+        <w:pStyle w:val="899"/>
         <w:numPr>
           <w:ilvl w:val="0"/>
           <w:numId w:val="3"/>
@@ -496,20 +480,22 @@
         <w:ind/>
         <w:rPr>
           <w:highlight w:val="none"/>
-          <w:lang w:val="undefined"/>
         </w:rPr>
       </w:pPr>
       <w:r>
         <w:rPr>
           <w:highlight w:val="none"/>
-          <w:lang w:val="undefined"/>
         </w:rPr>
         <w:t xml:space="preserve">Urlaubstand anfragen</w:t>
       </w:r>
       <w:r>
         <w:rPr>
           <w:highlight w:val="none"/>
-          <w:lang w:val="undefined"/>
+        </w:rPr>
+      </w:r>
+      <w:r>
+        <w:rPr>
+          <w:highlight w:val="none"/>
         </w:rPr>
       </w:r>
     </w:p>
@@ -520,26 +506,28 @@
         <w:ind/>
         <w:rPr>
           <w:highlight w:val="none"/>
-          <w:lang w:val="undefined"/>
         </w:rPr>
       </w:pPr>
       <w:r>
         <w:rPr>
           <w:highlight w:val="none"/>
-          <w:lang w:val="undefined"/>
         </w:rPr>
         <w:t xml:space="preserve">Admin Funktionen:</w:t>
       </w:r>
       <w:r>
         <w:rPr>
           <w:highlight w:val="none"/>
-          <w:lang w:val="undefined"/>
+        </w:rPr>
+      </w:r>
+      <w:r>
+        <w:rPr>
+          <w:highlight w:val="none"/>
         </w:rPr>
       </w:r>
     </w:p>
     <w:p>
       <w:pPr>
-        <w:pStyle w:val="885"/>
+        <w:pStyle w:val="899"/>
         <w:numPr>
           <w:ilvl w:val="0"/>
           <w:numId w:val="4"/>
@@ -549,26 +537,28 @@
         <w:ind/>
         <w:rPr>
           <w:highlight w:val="none"/>
-          <w:lang w:val="undefined"/>
         </w:rPr>
       </w:pPr>
       <w:r>
         <w:rPr>
           <w:highlight w:val="none"/>
-          <w:lang w:val="undefined"/>
         </w:rPr>
         <w:t xml:space="preserve">Urlaub genehmigen</w:t>
       </w:r>
       <w:r>
         <w:rPr>
           <w:highlight w:val="none"/>
-          <w:lang w:val="undefined"/>
+        </w:rPr>
+      </w:r>
+      <w:r>
+        <w:rPr>
+          <w:highlight w:val="none"/>
         </w:rPr>
       </w:r>
     </w:p>
     <w:p>
       <w:pPr>
-        <w:pStyle w:val="885"/>
+        <w:pStyle w:val="899"/>
         <w:numPr>
           <w:ilvl w:val="0"/>
           <w:numId w:val="4"/>
@@ -578,20 +568,22 @@
         <w:ind/>
         <w:rPr>
           <w:highlight w:val="none"/>
-          <w:lang w:val="undefined"/>
         </w:rPr>
       </w:pPr>
       <w:r>
         <w:rPr>
           <w:highlight w:val="none"/>
-          <w:lang w:val="undefined"/>
         </w:rPr>
         <w:t xml:space="preserve">Krankenstände und weiteres einsehen</w:t>
       </w:r>
       <w:r>
         <w:rPr>
           <w:highlight w:val="none"/>
-          <w:lang w:val="undefined"/>
+        </w:rPr>
+      </w:r>
+      <w:r>
+        <w:rPr>
+          <w:highlight w:val="none"/>
         </w:rPr>
       </w:r>
     </w:p>
@@ -602,26 +594,28 @@
         <w:ind/>
         <w:rPr>
           <w:highlight w:val="none"/>
-          <w:lang w:val="undefined"/>
         </w:rPr>
       </w:pPr>
       <w:r>
         <w:rPr>
           <w:highlight w:val="none"/>
-          <w:lang w:val="undefined"/>
         </w:rPr>
         <w:t xml:space="preserve">Extra Fenster für admin und user:</w:t>
       </w:r>
       <w:r>
         <w:rPr>
           <w:highlight w:val="none"/>
-          <w:lang w:val="undefined"/>
+        </w:rPr>
+      </w:r>
+      <w:r>
+        <w:rPr>
+          <w:highlight w:val="none"/>
         </w:rPr>
       </w:r>
     </w:p>
     <w:p>
       <w:pPr>
-        <w:pStyle w:val="885"/>
+        <w:pStyle w:val="899"/>
         <w:numPr>
           <w:ilvl w:val="0"/>
           <w:numId w:val="5"/>
@@ -631,13 +625,11 @@
         <w:ind/>
         <w:rPr>
           <w:highlight w:val="none"/>
-          <w:lang w:val="undefined"/>
         </w:rPr>
       </w:pPr>
       <w:r>
         <w:rPr>
           <w:highlight w:val="none"/>
-          <w:lang w:val="undefined"/>
         </w:rPr>
         <w:t xml:space="preserve">Dienstplan anzeigen</w:t>
       </w:r>
@@ -646,11 +638,17 @@
           <w:highlight w:val="none"/>
           <w:lang w:val="undefined"/>
         </w:rPr>
+        <w:t xml:space="preserve"> DONE</w:t>
+      </w:r>
+      <w:r>
+        <w:rPr>
+          <w:highlight w:val="none"/>
+        </w:rPr>
       </w:r>
     </w:p>
     <w:p>
       <w:pPr>
-        <w:pStyle w:val="885"/>
+        <w:pStyle w:val="899"/>
         <w:numPr>
           <w:ilvl w:val="0"/>
           <w:numId w:val="5"/>
@@ -660,29 +658,29 @@
         <w:ind/>
         <w:rPr>
           <w:highlight w:val="none"/>
-          <w:lang w:val="undefined"/>
         </w:rPr>
       </w:pPr>
       <w:r>
         <w:rPr>
           <w:highlight w:val="none"/>
-          <w:lang w:val="undefined"/>
         </w:rPr>
       </w:r>
       <w:r>
         <w:rPr>
           <w:highlight w:val="none"/>
-          <w:lang w:val="undefined"/>
         </w:rPr>
         <w:t xml:space="preserve">Passwort vergessen</w:t>
       </w:r>
       <w:r>
         <w:rPr>
           <w:highlight w:val="none"/>
-          <w:lang w:val="undefined"/>
         </w:rPr>
       </w:r>
-      <w:r/>
+      <w:r>
+        <w:rPr>
+          <w:highlight w:val="none"/>
+        </w:rPr>
+      </w:r>
     </w:p>
     <w:sectPr>
       <w:footnotePr/>
@@ -1968,9 +1966,9 @@
     <w:lsdException w:name="Bibliography" w:uiPriority="37"/>
     <w:lsdException w:name="TOC Heading" w:uiPriority="39" w:qFormat="1"/>
   </w:latentStyles>
-  <w:style w:type="table" w:styleId="697">
+  <w:style w:type="table" w:styleId="711">
     <w:name w:val="Table Grid"/>
-    <w:basedOn w:val="882"/>
+    <w:basedOn w:val="896"/>
     <w:uiPriority w:val="59"/>
     <w:pPr>
       <w:pBdr/>
@@ -2167,9 +2165,9 @@
       </w:tcPr>
     </w:tblStylePr>
   </w:style>
-  <w:style w:type="table" w:styleId="698">
+  <w:style w:type="table" w:styleId="712">
     <w:name w:val="Table Grid Light"/>
-    <w:basedOn w:val="882"/>
+    <w:basedOn w:val="896"/>
     <w:uiPriority w:val="59"/>
     <w:pPr>
       <w:pBdr/>
@@ -2366,9 +2364,9 @@
       </w:tcPr>
     </w:tblStylePr>
   </w:style>
-  <w:style w:type="table" w:styleId="699">
+  <w:style w:type="table" w:styleId="713">
     <w:name w:val="Plain Table 1"/>
-    <w:basedOn w:val="882"/>
+    <w:basedOn w:val="896"/>
     <w:uiPriority w:val="59"/>
     <w:pPr>
       <w:pBdr/>
@@ -2591,9 +2589,9 @@
       </w:tcPr>
     </w:tblStylePr>
   </w:style>
-  <w:style w:type="table" w:styleId="700">
+  <w:style w:type="table" w:styleId="714">
     <w:name w:val="Plain Table 2"/>
-    <w:basedOn w:val="882"/>
+    <w:basedOn w:val="896"/>
     <w:uiPriority w:val="59"/>
     <w:pPr>
       <w:pBdr/>
@@ -2824,9 +2822,9 @@
       </w:tcPr>
     </w:tblStylePr>
   </w:style>
-  <w:style w:type="table" w:styleId="701">
+  <w:style w:type="table" w:styleId="715">
     <w:name w:val="Plain Table 3"/>
-    <w:basedOn w:val="882"/>
+    <w:basedOn w:val="896"/>
     <w:uiPriority w:val="99"/>
     <w:pPr>
       <w:pBdr/>
@@ -3054,9 +3052,9 @@
       </w:tcPr>
     </w:tblStylePr>
   </w:style>
-  <w:style w:type="table" w:styleId="702">
+  <w:style w:type="table" w:styleId="716">
     <w:name w:val="Plain Table 4"/>
-    <w:basedOn w:val="882"/>
+    <w:basedOn w:val="896"/>
     <w:uiPriority w:val="99"/>
     <w:pPr>
       <w:pBdr/>
@@ -3270,9 +3268,9 @@
       </w:tcPr>
     </w:tblStylePr>
   </w:style>
-  <w:style w:type="table" w:styleId="703">
+  <w:style w:type="table" w:styleId="717">
     <w:name w:val="Plain Table 5"/>
-    <w:basedOn w:val="882"/>
+    <w:basedOn w:val="896"/>
     <w:uiPriority w:val="99"/>
     <w:pPr>
       <w:pBdr/>
@@ -3503,9 +3501,9 @@
       </w:tcPr>
     </w:tblStylePr>
   </w:style>
-  <w:style w:type="table" w:styleId="704">
+  <w:style w:type="table" w:styleId="718">
     <w:name w:val="Grid Table 1 Light"/>
-    <w:basedOn w:val="882"/>
+    <w:basedOn w:val="896"/>
     <w:uiPriority w:val="99"/>
     <w:pPr>
       <w:pBdr/>
@@ -3726,9 +3724,9 @@
       </w:tcPr>
     </w:tblStylePr>
   </w:style>
-  <w:style w:type="table" w:styleId="705">
+  <w:style w:type="table" w:styleId="719">
     <w:name w:val="Grid Table 1 Light - Accent 1"/>
-    <w:basedOn w:val="882"/>
+    <w:basedOn w:val="896"/>
     <w:uiPriority w:val="99"/>
     <w:pPr>
       <w:pBdr/>
@@ -3949,9 +3947,9 @@
       </w:tcPr>
     </w:tblStylePr>
   </w:style>
-  <w:style w:type="table" w:styleId="706">
+  <w:style w:type="table" w:styleId="720">
     <w:name w:val="Grid Table 1 Light - Accent 2"/>
-    <w:basedOn w:val="882"/>
+    <w:basedOn w:val="896"/>
     <w:uiPriority w:val="99"/>
     <w:pPr>
       <w:pBdr/>
@@ -4172,9 +4170,9 @@
       </w:tcPr>
     </w:tblStylePr>
   </w:style>
-  <w:style w:type="table" w:styleId="707">
+  <w:style w:type="table" w:styleId="721">
     <w:name w:val="Grid Table 1 Light - Accent 3"/>
-    <w:basedOn w:val="882"/>
+    <w:basedOn w:val="896"/>
     <w:uiPriority w:val="99"/>
     <w:pPr>
       <w:pBdr/>
@@ -4395,9 +4393,9 @@
       </w:tcPr>
     </w:tblStylePr>
   </w:style>
-  <w:style w:type="table" w:styleId="708">
+  <w:style w:type="table" w:styleId="722">
     <w:name w:val="Grid Table 1 Light - Accent 4"/>
-    <w:basedOn w:val="882"/>
+    <w:basedOn w:val="896"/>
     <w:uiPriority w:val="99"/>
     <w:pPr>
       <w:pBdr/>
@@ -4618,9 +4616,9 @@
       </w:tcPr>
     </w:tblStylePr>
   </w:style>
-  <w:style w:type="table" w:styleId="709">
+  <w:style w:type="table" w:styleId="723">
     <w:name w:val="Grid Table 1 Light - Accent 5"/>
-    <w:basedOn w:val="882"/>
+    <w:basedOn w:val="896"/>
     <w:uiPriority w:val="99"/>
     <w:pPr>
       <w:pBdr/>
@@ -4841,9 +4839,9 @@
       </w:tcPr>
     </w:tblStylePr>
   </w:style>
-  <w:style w:type="table" w:styleId="710">
+  <w:style w:type="table" w:styleId="724">
     <w:name w:val="Grid Table 1 Light - Accent 6"/>
-    <w:basedOn w:val="882"/>
+    <w:basedOn w:val="896"/>
     <w:uiPriority w:val="99"/>
     <w:pPr>
       <w:pBdr/>
@@ -5064,9 +5062,9 @@
       </w:tcPr>
     </w:tblStylePr>
   </w:style>
-  <w:style w:type="table" w:styleId="711">
+  <w:style w:type="table" w:styleId="725">
     <w:name w:val="Grid Table 2"/>
-    <w:basedOn w:val="882"/>
+    <w:basedOn w:val="896"/>
     <w:uiPriority w:val="99"/>
     <w:pPr>
       <w:pBdr/>
@@ -5296,9 +5294,9 @@
       </w:tcPr>
     </w:tblStylePr>
   </w:style>
-  <w:style w:type="table" w:styleId="712">
+  <w:style w:type="table" w:styleId="726">
     <w:name w:val="Grid Table 2 - Accent 1"/>
-    <w:basedOn w:val="882"/>
+    <w:basedOn w:val="896"/>
     <w:uiPriority w:val="99"/>
     <w:pPr>
       <w:pBdr/>
@@ -5528,9 +5526,9 @@
       </w:tcPr>
     </w:tblStylePr>
   </w:style>
-  <w:style w:type="table" w:styleId="713">
+  <w:style w:type="table" w:styleId="727">
     <w:name w:val="Grid Table 2 - Accent 2"/>
-    <w:basedOn w:val="882"/>
+    <w:basedOn w:val="896"/>
     <w:uiPriority w:val="99"/>
     <w:pPr>
       <w:pBdr/>
@@ -5760,9 +5758,9 @@
       </w:tcPr>
     </w:tblStylePr>
   </w:style>
-  <w:style w:type="table" w:styleId="714">
+  <w:style w:type="table" w:styleId="728">
     <w:name w:val="Grid Table 2 - Accent 3"/>
-    <w:basedOn w:val="882"/>
+    <w:basedOn w:val="896"/>
     <w:uiPriority w:val="99"/>
     <w:pPr>
       <w:pBdr/>
@@ -5992,9 +5990,9 @@
       </w:tcPr>
     </w:tblStylePr>
   </w:style>
-  <w:style w:type="table" w:styleId="715">
+  <w:style w:type="table" w:styleId="729">
     <w:name w:val="Grid Table 2 - Accent 4"/>
-    <w:basedOn w:val="882"/>
+    <w:basedOn w:val="896"/>
     <w:uiPriority w:val="99"/>
     <w:pPr>
       <w:pBdr/>
@@ -6224,9 +6222,9 @@
       </w:tcPr>
     </w:tblStylePr>
   </w:style>
-  <w:style w:type="table" w:styleId="716">
+  <w:style w:type="table" w:styleId="730">
     <w:name w:val="Grid Table 2 - Accent 5"/>
-    <w:basedOn w:val="882"/>
+    <w:basedOn w:val="896"/>
     <w:uiPriority w:val="99"/>
     <w:pPr>
       <w:pBdr/>
@@ -6456,9 +6454,9 @@
       </w:tcPr>
     </w:tblStylePr>
   </w:style>
-  <w:style w:type="table" w:styleId="717">
+  <w:style w:type="table" w:styleId="731">
     <w:name w:val="Grid Table 2 - Accent 6"/>
-    <w:basedOn w:val="882"/>
+    <w:basedOn w:val="896"/>
     <w:uiPriority w:val="99"/>
     <w:pPr>
       <w:pBdr/>
@@ -6688,9 +6686,9 @@
       </w:tcPr>
     </w:tblStylePr>
   </w:style>
-  <w:style w:type="table" w:styleId="718">
+  <w:style w:type="table" w:styleId="732">
     <w:name w:val="Grid Table 3"/>
-    <w:basedOn w:val="882"/>
+    <w:basedOn w:val="896"/>
     <w:uiPriority w:val="99"/>
     <w:pPr>
       <w:pBdr/>
@@ -6933,9 +6931,9 @@
       </w:tcPr>
     </w:tblStylePr>
   </w:style>
-  <w:style w:type="table" w:styleId="719">
+  <w:style w:type="table" w:styleId="733">
     <w:name w:val="Grid Table 3 - Accent 1"/>
-    <w:basedOn w:val="882"/>
+    <w:basedOn w:val="896"/>
     <w:uiPriority w:val="99"/>
     <w:pPr>
       <w:pBdr/>
@@ -7178,9 +7176,9 @@
       </w:tcPr>
     </w:tblStylePr>
   </w:style>
-  <w:style w:type="table" w:styleId="720">
+  <w:style w:type="table" w:styleId="734">
     <w:name w:val="Grid Table 3 - Accent 2"/>
-    <w:basedOn w:val="882"/>
+    <w:basedOn w:val="896"/>
     <w:uiPriority w:val="99"/>
     <w:pPr>
       <w:pBdr/>
@@ -7423,9 +7421,9 @@
       </w:tcPr>
     </w:tblStylePr>
   </w:style>
-  <w:style w:type="table" w:styleId="721">
+  <w:style w:type="table" w:styleId="735">
     <w:name w:val="Grid Table 3 - Accent 3"/>
-    <w:basedOn w:val="882"/>
+    <w:basedOn w:val="896"/>
     <w:uiPriority w:val="99"/>
     <w:pPr>
       <w:pBdr/>
@@ -7668,9 +7666,9 @@
       </w:tcPr>
     </w:tblStylePr>
   </w:style>
-  <w:style w:type="table" w:styleId="722">
+  <w:style w:type="table" w:styleId="736">
     <w:name w:val="Grid Table 3 - Accent 4"/>
-    <w:basedOn w:val="882"/>
+    <w:basedOn w:val="896"/>
     <w:uiPriority w:val="99"/>
     <w:pPr>
       <w:pBdr/>
@@ -7913,9 +7911,9 @@
       </w:tcPr>
     </w:tblStylePr>
   </w:style>
-  <w:style w:type="table" w:styleId="723">
+  <w:style w:type="table" w:styleId="737">
     <w:name w:val="Grid Table 3 - Accent 5"/>
-    <w:basedOn w:val="882"/>
+    <w:basedOn w:val="896"/>
     <w:uiPriority w:val="99"/>
     <w:pPr>
       <w:pBdr/>
@@ -8158,9 +8156,9 @@
       </w:tcPr>
     </w:tblStylePr>
   </w:style>
-  <w:style w:type="table" w:styleId="724">
+  <w:style w:type="table" w:styleId="738">
     <w:name w:val="Grid Table 3 - Accent 6"/>
-    <w:basedOn w:val="882"/>
+    <w:basedOn w:val="896"/>
     <w:uiPriority w:val="99"/>
     <w:pPr>
       <w:pBdr/>
@@ -8403,9 +8401,9 @@
       </w:tcPr>
     </w:tblStylePr>
   </w:style>
-  <w:style w:type="table" w:styleId="725">
+  <w:style w:type="table" w:styleId="739">
     <w:name w:val="Grid Table 4"/>
-    <w:basedOn w:val="882"/>
+    <w:basedOn w:val="896"/>
     <w:uiPriority w:val="59"/>
     <w:pPr>
       <w:pBdr/>
@@ -8636,9 +8634,9 @@
       </w:tcPr>
     </w:tblStylePr>
   </w:style>
-  <w:style w:type="table" w:styleId="726">
+  <w:style w:type="table" w:styleId="740">
     <w:name w:val="Grid Table 4 - Accent 1"/>
-    <w:basedOn w:val="882"/>
+    <w:basedOn w:val="896"/>
     <w:uiPriority w:val="59"/>
     <w:pPr>
       <w:pBdr/>
@@ -8869,9 +8867,9 @@
       </w:tcPr>
     </w:tblStylePr>
   </w:style>
-  <w:style w:type="table" w:styleId="727">
+  <w:style w:type="table" w:styleId="741">
     <w:name w:val="Grid Table 4 - Accent 2"/>
-    <w:basedOn w:val="882"/>
+    <w:basedOn w:val="896"/>
     <w:uiPriority w:val="59"/>
     <w:pPr>
       <w:pBdr/>
@@ -9102,9 +9100,9 @@
       </w:tcPr>
     </w:tblStylePr>
   </w:style>
-  <w:style w:type="table" w:styleId="728">
+  <w:style w:type="table" w:styleId="742">
     <w:name w:val="Grid Table 4 - Accent 3"/>
-    <w:basedOn w:val="882"/>
+    <w:basedOn w:val="896"/>
     <w:uiPriority w:val="59"/>
     <w:pPr>
       <w:pBdr/>
@@ -9335,9 +9333,9 @@
       </w:tcPr>
     </w:tblStylePr>
   </w:style>
-  <w:style w:type="table" w:styleId="729">
+  <w:style w:type="table" w:styleId="743">
     <w:name w:val="Grid Table 4 - Accent 4"/>
-    <w:basedOn w:val="882"/>
+    <w:basedOn w:val="896"/>
     <w:uiPriority w:val="59"/>
     <w:pPr>
       <w:pBdr/>
@@ -9568,9 +9566,9 @@
       </w:tcPr>
     </w:tblStylePr>
   </w:style>
-  <w:style w:type="table" w:styleId="730">
+  <w:style w:type="table" w:styleId="744">
     <w:name w:val="Grid Table 4 - Accent 5"/>
-    <w:basedOn w:val="882"/>
+    <w:basedOn w:val="896"/>
     <w:uiPriority w:val="59"/>
     <w:pPr>
       <w:pBdr/>
@@ -9801,9 +9799,9 @@
       </w:tcPr>
     </w:tblStylePr>
   </w:style>
-  <w:style w:type="table" w:styleId="731">
+  <w:style w:type="table" w:styleId="745">
     <w:name w:val="Grid Table 4 - Accent 6"/>
-    <w:basedOn w:val="882"/>
+    <w:basedOn w:val="896"/>
     <w:uiPriority w:val="59"/>
     <w:pPr>
       <w:pBdr/>
@@ -10034,9 +10032,9 @@
       </w:tcPr>
     </w:tblStylePr>
   </w:style>
-  <w:style w:type="table" w:styleId="732">
+  <w:style w:type="table" w:styleId="746">
     <w:name w:val="Grid Table 5 Dark"/>
-    <w:basedOn w:val="882"/>
+    <w:basedOn w:val="896"/>
     <w:uiPriority w:val="99"/>
     <w:pPr>
       <w:pBdr/>
@@ -10262,9 +10260,9 @@
       </w:tcPr>
     </w:tblStylePr>
   </w:style>
-  <w:style w:type="table" w:styleId="733">
+  <w:style w:type="table" w:styleId="747">
     <w:name w:val="Grid Table 5 Dark- Accent 1"/>
-    <w:basedOn w:val="882"/>
+    <w:basedOn w:val="896"/>
     <w:uiPriority w:val="99"/>
     <w:pPr>
       <w:pBdr/>
@@ -10490,9 +10488,9 @@
       </w:tcPr>
     </w:tblStylePr>
   </w:style>
-  <w:style w:type="table" w:styleId="734">
+  <w:style w:type="table" w:styleId="748">
     <w:name w:val="Grid Table 5 Dark - Accent 2"/>
-    <w:basedOn w:val="882"/>
+    <w:basedOn w:val="896"/>
     <w:uiPriority w:val="99"/>
     <w:pPr>
       <w:pBdr/>
@@ -10718,9 +10716,9 @@
       </w:tcPr>
     </w:tblStylePr>
   </w:style>
-  <w:style w:type="table" w:styleId="735">
+  <w:style w:type="table" w:styleId="749">
     <w:name w:val="Grid Table 5 Dark - Accent 3"/>
-    <w:basedOn w:val="882"/>
+    <w:basedOn w:val="896"/>
     <w:uiPriority w:val="99"/>
     <w:pPr>
       <w:pBdr/>
@@ -10946,9 +10944,9 @@
       </w:tcPr>
     </w:tblStylePr>
   </w:style>
-  <w:style w:type="table" w:styleId="736">
+  <w:style w:type="table" w:styleId="750">
     <w:name w:val="Grid Table 5 Dark- Accent 4"/>
-    <w:basedOn w:val="882"/>
+    <w:basedOn w:val="896"/>
     <w:uiPriority w:val="99"/>
     <w:pPr>
       <w:pBdr/>
@@ -11174,9 +11172,9 @@
       </w:tcPr>
     </w:tblStylePr>
   </w:style>
-  <w:style w:type="table" w:styleId="737">
+  <w:style w:type="table" w:styleId="751">
     <w:name w:val="Grid Table 5 Dark - Accent 5"/>
-    <w:basedOn w:val="882"/>
+    <w:basedOn w:val="896"/>
     <w:uiPriority w:val="99"/>
     <w:pPr>
       <w:pBdr/>
@@ -11402,9 +11400,9 @@
       </w:tcPr>
     </w:tblStylePr>
   </w:style>
-  <w:style w:type="table" w:styleId="738">
+  <w:style w:type="table" w:styleId="752">
     <w:name w:val="Grid Table 5 Dark - Accent 6"/>
-    <w:basedOn w:val="882"/>
+    <w:basedOn w:val="896"/>
     <w:uiPriority w:val="99"/>
     <w:pPr>
       <w:pBdr/>
@@ -11630,9 +11628,9 @@
       </w:tcPr>
     </w:tblStylePr>
   </w:style>
-  <w:style w:type="table" w:styleId="739">
+  <w:style w:type="table" w:styleId="753">
     <w:name w:val="Grid Table 6 Colorful"/>
-    <w:basedOn w:val="882"/>
+    <w:basedOn w:val="896"/>
     <w:uiPriority w:val="99"/>
     <w:pPr>
       <w:pBdr/>
@@ -11860,9 +11858,9 @@
       </w:tcPr>
     </w:tblStylePr>
   </w:style>
-  <w:style w:type="table" w:styleId="740">
+  <w:style w:type="table" w:styleId="754">
     <w:name w:val="Grid Table 6 Colorful - Accent 1"/>
-    <w:basedOn w:val="882"/>
+    <w:basedOn w:val="896"/>
     <w:uiPriority w:val="99"/>
     <w:pPr>
       <w:pBdr/>
@@ -12090,9 +12088,9 @@
       </w:tcPr>
     </w:tblStylePr>
   </w:style>
-  <w:style w:type="table" w:styleId="741">
+  <w:style w:type="table" w:styleId="755">
     <w:name w:val="Grid Table 6 Colorful - Accent 2"/>
-    <w:basedOn w:val="882"/>
+    <w:basedOn w:val="896"/>
     <w:uiPriority w:val="99"/>
     <w:pPr>
       <w:pBdr/>
@@ -12320,9 +12318,9 @@
       </w:tcPr>
     </w:tblStylePr>
   </w:style>
-  <w:style w:type="table" w:styleId="742">
+  <w:style w:type="table" w:styleId="756">
     <w:name w:val="Grid Table 6 Colorful - Accent 3"/>
-    <w:basedOn w:val="882"/>
+    <w:basedOn w:val="896"/>
     <w:uiPriority w:val="99"/>
     <w:pPr>
       <w:pBdr/>
@@ -12550,9 +12548,9 @@
       </w:tcPr>
     </w:tblStylePr>
   </w:style>
-  <w:style w:type="table" w:styleId="743">
+  <w:style w:type="table" w:styleId="757">
     <w:name w:val="Grid Table 6 Colorful - Accent 4"/>
-    <w:basedOn w:val="882"/>
+    <w:basedOn w:val="896"/>
     <w:uiPriority w:val="99"/>
     <w:pPr>
       <w:pBdr/>
@@ -12780,9 +12778,9 @@
       </w:tcPr>
     </w:tblStylePr>
   </w:style>
-  <w:style w:type="table" w:styleId="744">
+  <w:style w:type="table" w:styleId="758">
     <w:name w:val="Grid Table 6 Colorful - Accent 5"/>
-    <w:basedOn w:val="882"/>
+    <w:basedOn w:val="896"/>
     <w:uiPriority w:val="99"/>
     <w:pPr>
       <w:pBdr/>
@@ -13010,9 +13008,9 @@
       </w:tcPr>
     </w:tblStylePr>
   </w:style>
-  <w:style w:type="table" w:styleId="745">
+  <w:style w:type="table" w:styleId="759">
     <w:name w:val="Grid Table 6 Colorful - Accent 6"/>
-    <w:basedOn w:val="882"/>
+    <w:basedOn w:val="896"/>
     <w:uiPriority w:val="99"/>
     <w:pPr>
       <w:pBdr/>
@@ -13240,9 +13238,9 @@
       </w:tcPr>
     </w:tblStylePr>
   </w:style>
-  <w:style w:type="table" w:styleId="746">
+  <w:style w:type="table" w:styleId="760">
     <w:name w:val="Grid Table 7 Colorful"/>
-    <w:basedOn w:val="882"/>
+    <w:basedOn w:val="896"/>
     <w:uiPriority w:val="99"/>
     <w:pPr>
       <w:pBdr/>
@@ -13494,9 +13492,9 @@
       </w:tcPr>
     </w:tblStylePr>
   </w:style>
-  <w:style w:type="table" w:styleId="747">
+  <w:style w:type="table" w:styleId="761">
     <w:name w:val="Grid Table 7 Colorful - Accent 1"/>
-    <w:basedOn w:val="882"/>
+    <w:basedOn w:val="896"/>
     <w:uiPriority w:val="99"/>
     <w:pPr>
       <w:pBdr/>
@@ -13748,9 +13746,9 @@
       </w:tcPr>
     </w:tblStylePr>
   </w:style>
-  <w:style w:type="table" w:styleId="748">
+  <w:style w:type="table" w:styleId="762">
     <w:name w:val="Grid Table 7 Colorful - Accent 2"/>
-    <w:basedOn w:val="882"/>
+    <w:basedOn w:val="896"/>
     <w:uiPriority w:val="99"/>
     <w:pPr>
       <w:pBdr/>
@@ -14002,9 +14000,9 @@
       </w:tcPr>
     </w:tblStylePr>
   </w:style>
-  <w:style w:type="table" w:styleId="749">
+  <w:style w:type="table" w:styleId="763">
     <w:name w:val="Grid Table 7 Colorful - Accent 3"/>
-    <w:basedOn w:val="882"/>
+    <w:basedOn w:val="896"/>
     <w:uiPriority w:val="99"/>
     <w:pPr>
       <w:pBdr/>
@@ -14256,9 +14254,9 @@
       </w:tcPr>
     </w:tblStylePr>
   </w:style>
-  <w:style w:type="table" w:styleId="750">
+  <w:style w:type="table" w:styleId="764">
     <w:name w:val="Grid Table 7 Colorful - Accent 4"/>
-    <w:basedOn w:val="882"/>
+    <w:basedOn w:val="896"/>
     <w:uiPriority w:val="99"/>
     <w:pPr>
       <w:pBdr/>
@@ -14510,9 +14508,9 @@
       </w:tcPr>
     </w:tblStylePr>
   </w:style>
-  <w:style w:type="table" w:styleId="751">
+  <w:style w:type="table" w:styleId="765">
     <w:name w:val="Grid Table 7 Colorful - Accent 5"/>
-    <w:basedOn w:val="882"/>
+    <w:basedOn w:val="896"/>
     <w:uiPriority w:val="99"/>
     <w:pPr>
       <w:pBdr/>
@@ -14764,9 +14762,9 @@
       </w:tcPr>
     </w:tblStylePr>
   </w:style>
-  <w:style w:type="table" w:styleId="752">
+  <w:style w:type="table" w:styleId="766">
     <w:name w:val="Grid Table 7 Colorful - Accent 6"/>
-    <w:basedOn w:val="882"/>
+    <w:basedOn w:val="896"/>
     <w:uiPriority w:val="99"/>
     <w:pPr>
       <w:pBdr/>
@@ -15018,9 +15016,9 @@
       </w:tcPr>
     </w:tblStylePr>
   </w:style>
-  <w:style w:type="table" w:styleId="753">
+  <w:style w:type="table" w:styleId="767">
     <w:name w:val="List Table 1 Light"/>
-    <w:basedOn w:val="882"/>
+    <w:basedOn w:val="896"/>
     <w:uiPriority w:val="99"/>
     <w:pPr>
       <w:pBdr/>
@@ -15234,9 +15232,9 @@
       </w:tcPr>
     </w:tblStylePr>
   </w:style>
-  <w:style w:type="table" w:styleId="754">
+  <w:style w:type="table" w:styleId="768">
     <w:name w:val="List Table 1 Light - Accent 1"/>
-    <w:basedOn w:val="882"/>
+    <w:basedOn w:val="896"/>
     <w:uiPriority w:val="99"/>
     <w:pPr>
       <w:pBdr/>
@@ -15450,9 +15448,9 @@
       </w:tcPr>
     </w:tblStylePr>
   </w:style>
-  <w:style w:type="table" w:styleId="755">
+  <w:style w:type="table" w:styleId="769">
     <w:name w:val="List Table 1 Light - Accent 2"/>
-    <w:basedOn w:val="882"/>
+    <w:basedOn w:val="896"/>
     <w:uiPriority w:val="99"/>
     <w:pPr>
       <w:pBdr/>
@@ -15666,9 +15664,9 @@
       </w:tcPr>
     </w:tblStylePr>
   </w:style>
-  <w:style w:type="table" w:styleId="756">
+  <w:style w:type="table" w:styleId="770">
     <w:name w:val="List Table 1 Light - Accent 3"/>
-    <w:basedOn w:val="882"/>
+    <w:basedOn w:val="896"/>
     <w:uiPriority w:val="99"/>
     <w:pPr>
       <w:pBdr/>
@@ -15882,9 +15880,9 @@
       </w:tcPr>
     </w:tblStylePr>
   </w:style>
-  <w:style w:type="table" w:styleId="757">
+  <w:style w:type="table" w:styleId="771">
     <w:name w:val="List Table 1 Light - Accent 4"/>
-    <w:basedOn w:val="882"/>
+    <w:basedOn w:val="896"/>
     <w:uiPriority w:val="99"/>
     <w:pPr>
       <w:pBdr/>
@@ -16098,9 +16096,9 @@
       </w:tcPr>
     </w:tblStylePr>
   </w:style>
-  <w:style w:type="table" w:styleId="758">
+  <w:style w:type="table" w:styleId="772">
     <w:name w:val="List Table 1 Light - Accent 5"/>
-    <w:basedOn w:val="882"/>
+    <w:basedOn w:val="896"/>
     <w:uiPriority w:val="99"/>
     <w:pPr>
       <w:pBdr/>
@@ -16314,9 +16312,9 @@
       </w:tcPr>
     </w:tblStylePr>
   </w:style>
-  <w:style w:type="table" w:styleId="759">
+  <w:style w:type="table" w:styleId="773">
     <w:name w:val="List Table 1 Light - Accent 6"/>
-    <w:basedOn w:val="882"/>
+    <w:basedOn w:val="896"/>
     <w:uiPriority w:val="99"/>
     <w:pPr>
       <w:pBdr/>
@@ -16530,9 +16528,9 @@
       </w:tcPr>
     </w:tblStylePr>
   </w:style>
-  <w:style w:type="table" w:styleId="760">
+  <w:style w:type="table" w:styleId="774">
     <w:name w:val="List Table 2"/>
-    <w:basedOn w:val="882"/>
+    <w:basedOn w:val="896"/>
     <w:uiPriority w:val="99"/>
     <w:pPr>
       <w:pBdr/>
@@ -16768,9 +16766,9 @@
       </w:tcPr>
     </w:tblStylePr>
   </w:style>
-  <w:style w:type="table" w:styleId="761">
+  <w:style w:type="table" w:styleId="775">
     <w:name w:val="List Table 2 - Accent 1"/>
-    <w:basedOn w:val="882"/>
+    <w:basedOn w:val="896"/>
     <w:uiPriority w:val="99"/>
     <w:pPr>
       <w:pBdr/>
@@ -17006,9 +17004,9 @@
       </w:tcPr>
     </w:tblStylePr>
   </w:style>
-  <w:style w:type="table" w:styleId="762">
+  <w:style w:type="table" w:styleId="776">
     <w:name w:val="List Table 2 - Accent 2"/>
-    <w:basedOn w:val="882"/>
+    <w:basedOn w:val="896"/>
     <w:uiPriority w:val="99"/>
     <w:pPr>
       <w:pBdr/>
@@ -17244,9 +17242,9 @@
       </w:tcPr>
     </w:tblStylePr>
   </w:style>
-  <w:style w:type="table" w:styleId="763">
+  <w:style w:type="table" w:styleId="777">
     <w:name w:val="List Table 2 - Accent 3"/>
-    <w:basedOn w:val="882"/>
+    <w:basedOn w:val="896"/>
     <w:uiPriority w:val="99"/>
     <w:pPr>
       <w:pBdr/>
@@ -17482,9 +17480,9 @@
       </w:tcPr>
     </w:tblStylePr>
   </w:style>
-  <w:style w:type="table" w:styleId="764">
+  <w:style w:type="table" w:styleId="778">
     <w:name w:val="List Table 2 - Accent 4"/>
-    <w:basedOn w:val="882"/>
+    <w:basedOn w:val="896"/>
     <w:uiPriority w:val="99"/>
     <w:pPr>
       <w:pBdr/>
@@ -17720,9 +17718,9 @@
       </w:tcPr>
     </w:tblStylePr>
   </w:style>
-  <w:style w:type="table" w:styleId="765">
+  <w:style w:type="table" w:styleId="779">
     <w:name w:val="List Table 2 - Accent 5"/>
-    <w:basedOn w:val="882"/>
+    <w:basedOn w:val="896"/>
     <w:uiPriority w:val="99"/>
     <w:pPr>
       <w:pBdr/>
@@ -17958,9 +17956,9 @@
       </w:tcPr>
     </w:tblStylePr>
   </w:style>
-  <w:style w:type="table" w:styleId="766">
+  <w:style w:type="table" w:styleId="780">
     <w:name w:val="List Table 2 - Accent 6"/>
-    <w:basedOn w:val="882"/>
+    <w:basedOn w:val="896"/>
     <w:uiPriority w:val="99"/>
     <w:pPr>
       <w:pBdr/>
@@ -18196,9 +18194,9 @@
       </w:tcPr>
     </w:tblStylePr>
   </w:style>
-  <w:style w:type="table" w:styleId="767">
+  <w:style w:type="table" w:styleId="781">
     <w:name w:val="List Table 3"/>
-    <w:basedOn w:val="882"/>
+    <w:basedOn w:val="896"/>
     <w:uiPriority w:val="99"/>
     <w:pPr>
       <w:pBdr/>
@@ -18424,9 +18422,9 @@
       </w:tcPr>
     </w:tblStylePr>
   </w:style>
-  <w:style w:type="table" w:styleId="768">
+  <w:style w:type="table" w:styleId="782">
     <w:name w:val="List Table 3 - Accent 1"/>
-    <w:basedOn w:val="882"/>
+    <w:basedOn w:val="896"/>
     <w:uiPriority w:val="99"/>
     <w:pPr>
       <w:pBdr/>
@@ -18652,9 +18650,9 @@
       </w:tcPr>
     </w:tblStylePr>
   </w:style>
-  <w:style w:type="table" w:styleId="769">
+  <w:style w:type="table" w:styleId="783">
     <w:name w:val="List Table 3 - Accent 2"/>
-    <w:basedOn w:val="882"/>
+    <w:basedOn w:val="896"/>
     <w:uiPriority w:val="99"/>
     <w:pPr>
       <w:pBdr/>
@@ -18880,9 +18878,9 @@
       </w:tcPr>
     </w:tblStylePr>
   </w:style>
-  <w:style w:type="table" w:styleId="770">
+  <w:style w:type="table" w:styleId="784">
     <w:name w:val="List Table 3 - Accent 3"/>
-    <w:basedOn w:val="882"/>
+    <w:basedOn w:val="896"/>
     <w:uiPriority w:val="99"/>
     <w:pPr>
       <w:pBdr/>
@@ -19108,9 +19106,9 @@
       </w:tcPr>
     </w:tblStylePr>
   </w:style>
-  <w:style w:type="table" w:styleId="771">
+  <w:style w:type="table" w:styleId="785">
     <w:name w:val="List Table 3 - Accent 4"/>
-    <w:basedOn w:val="882"/>
+    <w:basedOn w:val="896"/>
     <w:uiPriority w:val="99"/>
     <w:pPr>
       <w:pBdr/>
@@ -19336,9 +19334,9 @@
       </w:tcPr>
     </w:tblStylePr>
   </w:style>
-  <w:style w:type="table" w:styleId="772">
+  <w:style w:type="table" w:styleId="786">
     <w:name w:val="List Table 3 - Accent 5"/>
-    <w:basedOn w:val="882"/>
+    <w:basedOn w:val="896"/>
     <w:uiPriority w:val="99"/>
     <w:pPr>
       <w:pBdr/>
@@ -19564,9 +19562,9 @@
       </w:tcPr>
     </w:tblStylePr>
   </w:style>
-  <w:style w:type="table" w:styleId="773">
+  <w:style w:type="table" w:styleId="787">
     <w:name w:val="List Table 3 - Accent 6"/>
-    <w:basedOn w:val="882"/>
+    <w:basedOn w:val="896"/>
     <w:uiPriority w:val="99"/>
     <w:pPr>
       <w:pBdr/>
@@ -19792,9 +19790,9 @@
       </w:tcPr>
     </w:tblStylePr>
   </w:style>
-  <w:style w:type="table" w:styleId="774">
+  <w:style w:type="table" w:styleId="788">
     <w:name w:val="List Table 4"/>
-    <w:basedOn w:val="882"/>
+    <w:basedOn w:val="896"/>
     <w:uiPriority w:val="99"/>
     <w:pPr>
       <w:pBdr/>
@@ -20017,9 +20015,9 @@
       </w:tcPr>
     </w:tblStylePr>
   </w:style>
-  <w:style w:type="table" w:styleId="775">
+  <w:style w:type="table" w:styleId="789">
     <w:name w:val="List Table 4 - Accent 1"/>
-    <w:basedOn w:val="882"/>
+    <w:basedOn w:val="896"/>
     <w:uiPriority w:val="99"/>
     <w:pPr>
       <w:pBdr/>
@@ -20242,9 +20240,9 @@
       </w:tcPr>
     </w:tblStylePr>
   </w:style>
-  <w:style w:type="table" w:styleId="776">
+  <w:style w:type="table" w:styleId="790">
     <w:name w:val="List Table 4 - Accent 2"/>
-    <w:basedOn w:val="882"/>
+    <w:basedOn w:val="896"/>
     <w:uiPriority w:val="99"/>
     <w:pPr>
       <w:pBdr/>
@@ -20467,9 +20465,9 @@
       </w:tcPr>
     </w:tblStylePr>
   </w:style>
-  <w:style w:type="table" w:styleId="777">
+  <w:style w:type="table" w:styleId="791">
     <w:name w:val="List Table 4 - Accent 3"/>
-    <w:basedOn w:val="882"/>
+    <w:basedOn w:val="896"/>
     <w:uiPriority w:val="99"/>
     <w:pPr>
       <w:pBdr/>
@@ -20692,9 +20690,9 @@
       </w:tcPr>
     </w:tblStylePr>
   </w:style>
-  <w:style w:type="table" w:styleId="778">
+  <w:style w:type="table" w:styleId="792">
     <w:name w:val="List Table 4 - Accent 4"/>
-    <w:basedOn w:val="882"/>
+    <w:basedOn w:val="896"/>
     <w:uiPriority w:val="99"/>
     <w:pPr>
       <w:pBdr/>
@@ -20917,9 +20915,9 @@
       </w:tcPr>
     </w:tblStylePr>
   </w:style>
-  <w:style w:type="table" w:styleId="779">
+  <w:style w:type="table" w:styleId="793">
     <w:name w:val="List Table 4 - Accent 5"/>
-    <w:basedOn w:val="882"/>
+    <w:basedOn w:val="896"/>
     <w:uiPriority w:val="99"/>
     <w:pPr>
       <w:pBdr/>
@@ -21142,9 +21140,9 @@
       </w:tcPr>
     </w:tblStylePr>
   </w:style>
-  <w:style w:type="table" w:styleId="780">
+  <w:style w:type="table" w:styleId="794">
     <w:name w:val="List Table 4 - Accent 6"/>
-    <w:basedOn w:val="882"/>
+    <w:basedOn w:val="896"/>
     <w:uiPriority w:val="99"/>
     <w:pPr>
       <w:pBdr/>
@@ -21367,9 +21365,9 @@
       </w:tcPr>
     </w:tblStylePr>
   </w:style>
-  <w:style w:type="table" w:styleId="781">
+  <w:style w:type="table" w:styleId="795">
     <w:name w:val="List Table 5 Dark"/>
-    <w:basedOn w:val="882"/>
+    <w:basedOn w:val="896"/>
     <w:uiPriority w:val="99"/>
     <w:pPr>
       <w:pBdr/>
@@ -21609,9 +21607,9 @@
       </w:tcPr>
     </w:tblStylePr>
   </w:style>
-  <w:style w:type="table" w:styleId="782">
+  <w:style w:type="table" w:styleId="796">
     <w:name w:val="List Table 5 Dark - Accent 1"/>
-    <w:basedOn w:val="882"/>
+    <w:basedOn w:val="896"/>
     <w:uiPriority w:val="99"/>
     <w:pPr>
       <w:pBdr/>
@@ -21851,9 +21849,9 @@
       </w:tcPr>
     </w:tblStylePr>
   </w:style>
-  <w:style w:type="table" w:styleId="783">
+  <w:style w:type="table" w:styleId="797">
     <w:name w:val="List Table 5 Dark - Accent 2"/>
-    <w:basedOn w:val="882"/>
+    <w:basedOn w:val="896"/>
     <w:uiPriority w:val="99"/>
     <w:pPr>
       <w:pBdr/>
@@ -22093,9 +22091,9 @@
       </w:tcPr>
     </w:tblStylePr>
   </w:style>
-  <w:style w:type="table" w:styleId="784">
+  <w:style w:type="table" w:styleId="798">
     <w:name w:val="List Table 5 Dark - Accent 3"/>
-    <w:basedOn w:val="882"/>
+    <w:basedOn w:val="896"/>
     <w:uiPriority w:val="99"/>
     <w:pPr>
       <w:pBdr/>
@@ -22335,9 +22333,9 @@
       </w:tcPr>
     </w:tblStylePr>
   </w:style>
-  <w:style w:type="table" w:styleId="785">
+  <w:style w:type="table" w:styleId="799">
     <w:name w:val="List Table 5 Dark - Accent 4"/>
-    <w:basedOn w:val="882"/>
+    <w:basedOn w:val="896"/>
     <w:uiPriority w:val="99"/>
     <w:pPr>
       <w:pBdr/>
@@ -22577,9 +22575,9 @@
       </w:tcPr>
     </w:tblStylePr>
   </w:style>
-  <w:style w:type="table" w:styleId="786">
+  <w:style w:type="table" w:styleId="800">
     <w:name w:val="List Table 5 Dark - Accent 5"/>
-    <w:basedOn w:val="882"/>
+    <w:basedOn w:val="896"/>
     <w:uiPriority w:val="99"/>
     <w:pPr>
       <w:pBdr/>
@@ -22819,9 +22817,9 @@
       </w:tcPr>
     </w:tblStylePr>
   </w:style>
-  <w:style w:type="table" w:styleId="787">
+  <w:style w:type="table" w:styleId="801">
     <w:name w:val="List Table 5 Dark - Accent 6"/>
-    <w:basedOn w:val="882"/>
+    <w:basedOn w:val="896"/>
     <w:uiPriority w:val="99"/>
     <w:pPr>
       <w:pBdr/>
@@ -23061,9 +23059,9 @@
       </w:tcPr>
     </w:tblStylePr>
   </w:style>
-  <w:style w:type="table" w:styleId="788">
+  <w:style w:type="table" w:styleId="802">
     <w:name w:val="List Table 6 Colorful"/>
-    <w:basedOn w:val="882"/>
+    <w:basedOn w:val="896"/>
     <w:uiPriority w:val="99"/>
     <w:pPr>
       <w:pBdr/>
@@ -23284,9 +23282,9 @@
       </w:tcPr>
     </w:tblStylePr>
   </w:style>
-  <w:style w:type="table" w:styleId="789">
+  <w:style w:type="table" w:styleId="803">
     <w:name w:val="List Table 6 Colorful - Accent 1"/>
-    <w:basedOn w:val="882"/>
+    <w:basedOn w:val="896"/>
     <w:uiPriority w:val="99"/>
     <w:pPr>
       <w:pBdr/>
@@ -23507,9 +23505,9 @@
       </w:tcPr>
     </w:tblStylePr>
   </w:style>
-  <w:style w:type="table" w:styleId="790">
+  <w:style w:type="table" w:styleId="804">
     <w:name w:val="List Table 6 Colorful - Accent 2"/>
-    <w:basedOn w:val="882"/>
+    <w:basedOn w:val="896"/>
     <w:uiPriority w:val="99"/>
     <w:pPr>
       <w:pBdr/>
@@ -23730,9 +23728,9 @@
       </w:tcPr>
     </w:tblStylePr>
   </w:style>
-  <w:style w:type="table" w:styleId="791">
+  <w:style w:type="table" w:styleId="805">
     <w:name w:val="List Table 6 Colorful - Accent 3"/>
-    <w:basedOn w:val="882"/>
+    <w:basedOn w:val="896"/>
     <w:uiPriority w:val="99"/>
     <w:pPr>
       <w:pBdr/>
@@ -23953,9 +23951,9 @@
       </w:tcPr>
     </w:tblStylePr>
   </w:style>
-  <w:style w:type="table" w:styleId="792">
+  <w:style w:type="table" w:styleId="806">
     <w:name w:val="List Table 6 Colorful - Accent 4"/>
-    <w:basedOn w:val="882"/>
+    <w:basedOn w:val="896"/>
     <w:uiPriority w:val="99"/>
     <w:pPr>
       <w:pBdr/>
@@ -24176,9 +24174,9 @@
       </w:tcPr>
     </w:tblStylePr>
   </w:style>
-  <w:style w:type="table" w:styleId="793">
+  <w:style w:type="table" w:styleId="807">
     <w:name w:val="List Table 6 Colorful - Accent 5"/>
-    <w:basedOn w:val="882"/>
+    <w:basedOn w:val="896"/>
     <w:uiPriority w:val="99"/>
     <w:pPr>
       <w:pBdr/>
@@ -24399,9 +24397,9 @@
       </w:tcPr>
     </w:tblStylePr>
   </w:style>
-  <w:style w:type="table" w:styleId="794">
+  <w:style w:type="table" w:styleId="808">
     <w:name w:val="List Table 6 Colorful - Accent 6"/>
-    <w:basedOn w:val="882"/>
+    <w:basedOn w:val="896"/>
     <w:uiPriority w:val="99"/>
     <w:pPr>
       <w:pBdr/>
@@ -24622,9 +24620,9 @@
       </w:tcPr>
     </w:tblStylePr>
   </w:style>
-  <w:style w:type="table" w:styleId="795">
+  <w:style w:type="table" w:styleId="809">
     <w:name w:val="List Table 7 Colorful"/>
-    <w:basedOn w:val="882"/>
+    <w:basedOn w:val="896"/>
     <w:uiPriority w:val="99"/>
     <w:pPr>
       <w:pBdr/>
@@ -24878,9 +24876,9 @@
       </w:tcPr>
     </w:tblStylePr>
   </w:style>
-  <w:style w:type="table" w:styleId="796">
+  <w:style w:type="table" w:styleId="810">
     <w:name w:val="List Table 7 Colorful - Accent 1"/>
-    <w:basedOn w:val="882"/>
+    <w:basedOn w:val="896"/>
     <w:uiPriority w:val="99"/>
     <w:pPr>
       <w:pBdr/>
@@ -25134,9 +25132,9 @@
       </w:tcPr>
     </w:tblStylePr>
   </w:style>
-  <w:style w:type="table" w:styleId="797">
+  <w:style w:type="table" w:styleId="811">
     <w:name w:val="List Table 7 Colorful - Accent 2"/>
-    <w:basedOn w:val="882"/>
+    <w:basedOn w:val="896"/>
     <w:uiPriority w:val="99"/>
     <w:pPr>
       <w:pBdr/>
@@ -25390,9 +25388,9 @@
       </w:tcPr>
     </w:tblStylePr>
   </w:style>
-  <w:style w:type="table" w:styleId="798">
+  <w:style w:type="table" w:styleId="812">
     <w:name w:val="List Table 7 Colorful - Accent 3"/>
-    <w:basedOn w:val="882"/>
+    <w:basedOn w:val="896"/>
     <w:uiPriority w:val="99"/>
     <w:pPr>
       <w:pBdr/>
@@ -25646,9 +25644,9 @@
       </w:tcPr>
     </w:tblStylePr>
   </w:style>
-  <w:style w:type="table" w:styleId="799">
+  <w:style w:type="table" w:styleId="813">
     <w:name w:val="List Table 7 Colorful - Accent 4"/>
-    <w:basedOn w:val="882"/>
+    <w:basedOn w:val="896"/>
     <w:uiPriority w:val="99"/>
     <w:pPr>
       <w:pBdr/>
@@ -25902,9 +25900,9 @@
       </w:tcPr>
     </w:tblStylePr>
   </w:style>
-  <w:style w:type="table" w:styleId="800">
+  <w:style w:type="table" w:styleId="814">
     <w:name w:val="List Table 7 Colorful - Accent 5"/>
-    <w:basedOn w:val="882"/>
+    <w:basedOn w:val="896"/>
     <w:uiPriority w:val="99"/>
     <w:pPr>
       <w:pBdr/>
@@ -26158,9 +26156,9 @@
       </w:tcPr>
     </w:tblStylePr>
   </w:style>
-  <w:style w:type="table" w:styleId="801">
+  <w:style w:type="table" w:styleId="815">
     <w:name w:val="List Table 7 Colorful - Accent 6"/>
-    <w:basedOn w:val="882"/>
+    <w:basedOn w:val="896"/>
     <w:uiPriority w:val="99"/>
     <w:pPr>
       <w:pBdr/>
@@ -26414,9 +26412,9 @@
       </w:tcPr>
     </w:tblStylePr>
   </w:style>
-  <w:style w:type="table" w:styleId="802">
+  <w:style w:type="table" w:styleId="816">
     <w:name w:val="Lined - Accent"/>
-    <w:basedOn w:val="882"/>
+    <w:basedOn w:val="896"/>
     <w:uiPriority w:val="99"/>
     <w:pPr>
       <w:pBdr/>
@@ -26651,9 +26649,9 @@
       </w:tcPr>
     </w:tblStylePr>
   </w:style>
-  <w:style w:type="table" w:styleId="803">
+  <w:style w:type="table" w:styleId="817">
     <w:name w:val="Lined - Accent 1"/>
-    <w:basedOn w:val="882"/>
+    <w:basedOn w:val="896"/>
     <w:uiPriority w:val="99"/>
     <w:pPr>
       <w:pBdr/>
@@ -26888,9 +26886,9 @@
       </w:tcPr>
     </w:tblStylePr>
   </w:style>
-  <w:style w:type="table" w:styleId="804">
+  <w:style w:type="table" w:styleId="818">
     <w:name w:val="Lined - Accent 2"/>
-    <w:basedOn w:val="882"/>
+    <w:basedOn w:val="896"/>
     <w:uiPriority w:val="99"/>
     <w:pPr>
       <w:pBdr/>
@@ -27125,9 +27123,9 @@
       </w:tcPr>
     </w:tblStylePr>
   </w:style>
-  <w:style w:type="table" w:styleId="805">
+  <w:style w:type="table" w:styleId="819">
     <w:name w:val="Lined - Accent 3"/>
-    <w:basedOn w:val="882"/>
+    <w:basedOn w:val="896"/>
     <w:uiPriority w:val="99"/>
     <w:pPr>
       <w:pBdr/>
@@ -27362,9 +27360,9 @@
       </w:tcPr>
     </w:tblStylePr>
   </w:style>
-  <w:style w:type="table" w:styleId="806">
+  <w:style w:type="table" w:styleId="820">
     <w:name w:val="Lined - Accent 4"/>
-    <w:basedOn w:val="882"/>
+    <w:basedOn w:val="896"/>
     <w:uiPriority w:val="99"/>
     <w:pPr>
       <w:pBdr/>
@@ -27599,9 +27597,9 @@
       </w:tcPr>
     </w:tblStylePr>
   </w:style>
-  <w:style w:type="table" w:styleId="807">
+  <w:style w:type="table" w:styleId="821">
     <w:name w:val="Lined - Accent 5"/>
-    <w:basedOn w:val="882"/>
+    <w:basedOn w:val="896"/>
     <w:uiPriority w:val="99"/>
     <w:pPr>
       <w:pBdr/>
@@ -27836,9 +27834,9 @@
       </w:tcPr>
     </w:tblStylePr>
   </w:style>
-  <w:style w:type="table" w:styleId="808">
+  <w:style w:type="table" w:styleId="822">
     <w:name w:val="Lined - Accent 6"/>
-    <w:basedOn w:val="882"/>
+    <w:basedOn w:val="896"/>
     <w:uiPriority w:val="99"/>
     <w:pPr>
       <w:pBdr/>
@@ -28073,9 +28071,9 @@
       </w:tcPr>
     </w:tblStylePr>
   </w:style>
-  <w:style w:type="table" w:styleId="809">
+  <w:style w:type="table" w:styleId="823">
     <w:name w:val="Bordered &amp; Lined - Accent"/>
-    <w:basedOn w:val="882"/>
+    <w:basedOn w:val="896"/>
     <w:uiPriority w:val="99"/>
     <w:pPr>
       <w:pBdr/>
@@ -28317,9 +28315,9 @@
       </w:tcPr>
     </w:tblStylePr>
   </w:style>
-  <w:style w:type="table" w:styleId="810">
+  <w:style w:type="table" w:styleId="824">
     <w:name w:val="Bordered &amp; Lined - Accent 1"/>
-    <w:basedOn w:val="882"/>
+    <w:basedOn w:val="896"/>
     <w:uiPriority w:val="99"/>
     <w:pPr>
       <w:pBdr/>
@@ -28561,9 +28559,9 @@
       </w:tcPr>
     </w:tblStylePr>
   </w:style>
-  <w:style w:type="table" w:styleId="811">
+  <w:style w:type="table" w:styleId="825">
     <w:name w:val="Bordered &amp; Lined - Accent 2"/>
-    <w:basedOn w:val="882"/>
+    <w:basedOn w:val="896"/>
     <w:uiPriority w:val="99"/>
     <w:pPr>
       <w:pBdr/>
@@ -28805,9 +28803,9 @@
       </w:tcPr>
     </w:tblStylePr>
   </w:style>
-  <w:style w:type="table" w:styleId="812">
+  <w:style w:type="table" w:styleId="826">
     <w:name w:val="Bordered &amp; Lined - Accent 3"/>
-    <w:basedOn w:val="882"/>
+    <w:basedOn w:val="896"/>
     <w:uiPriority w:val="99"/>
     <w:pPr>
       <w:pBdr/>
@@ -29049,9 +29047,9 @@
       </w:tcPr>
     </w:tblStylePr>
   </w:style>
-  <w:style w:type="table" w:styleId="813">
+  <w:style w:type="table" w:styleId="827">
     <w:name w:val="Bordered &amp; Lined - Accent 4"/>
-    <w:basedOn w:val="882"/>
+    <w:basedOn w:val="896"/>
     <w:uiPriority w:val="99"/>
     <w:pPr>
       <w:pBdr/>
@@ -29293,9 +29291,9 @@
       </w:tcPr>
     </w:tblStylePr>
   </w:style>
-  <w:style w:type="table" w:styleId="814">
+  <w:style w:type="table" w:styleId="828">
     <w:name w:val="Bordered &amp; Lined - Accent 5"/>
-    <w:basedOn w:val="882"/>
+    <w:basedOn w:val="896"/>
     <w:uiPriority w:val="99"/>
     <w:pPr>
       <w:pBdr/>
@@ -29537,9 +29535,9 @@
       </w:tcPr>
     </w:tblStylePr>
   </w:style>
-  <w:style w:type="table" w:styleId="815">
+  <w:style w:type="table" w:styleId="829">
     <w:name w:val="Bordered &amp; Lined - Accent 6"/>
-    <w:basedOn w:val="882"/>
+    <w:basedOn w:val="896"/>
     <w:uiPriority w:val="99"/>
     <w:pPr>
       <w:pBdr/>
@@ -29781,9 +29779,9 @@
       </w:tcPr>
     </w:tblStylePr>
   </w:style>
-  <w:style w:type="table" w:styleId="816">
+  <w:style w:type="table" w:styleId="830">
     <w:name w:val="Bordered"/>
-    <w:basedOn w:val="882"/>
+    <w:basedOn w:val="896"/>
     <w:uiPriority w:val="99"/>
     <w:pPr>
       <w:pBdr/>
@@ -30012,9 +30010,9 @@
       </w:tcPr>
     </w:tblStylePr>
   </w:style>
-  <w:style w:type="table" w:styleId="817">
+  <w:style w:type="table" w:styleId="831">
     <w:name w:val="Bordered - Accent 1"/>
-    <w:basedOn w:val="882"/>
+    <w:basedOn w:val="896"/>
     <w:uiPriority w:val="99"/>
     <w:pPr>
       <w:pBdr/>
@@ -30243,9 +30241,9 @@
       </w:tcPr>
     </w:tblStylePr>
   </w:style>
-  <w:style w:type="table" w:styleId="818">
+  <w:style w:type="table" w:styleId="832">
     <w:name w:val="Bordered - Accent 2"/>
-    <w:basedOn w:val="882"/>
+    <w:basedOn w:val="896"/>
     <w:uiPriority w:val="99"/>
     <w:pPr>
       <w:pBdr/>
@@ -30474,9 +30472,9 @@
       </w:tcPr>
     </w:tblStylePr>
   </w:style>
-  <w:style w:type="table" w:styleId="819">
+  <w:style w:type="table" w:styleId="833">
     <w:name w:val="Bordered - Accent 3"/>
-    <w:basedOn w:val="882"/>
+    <w:basedOn w:val="896"/>
     <w:uiPriority w:val="99"/>
     <w:pPr>
       <w:pBdr/>
@@ -30705,9 +30703,9 @@
       </w:tcPr>
     </w:tblStylePr>
   </w:style>
-  <w:style w:type="table" w:styleId="820">
+  <w:style w:type="table" w:styleId="834">
     <w:name w:val="Bordered - Accent 4"/>
-    <w:basedOn w:val="882"/>
+    <w:basedOn w:val="896"/>
     <w:uiPriority w:val="99"/>
     <w:pPr>
       <w:pBdr/>
@@ -30936,9 +30934,9 @@
       </w:tcPr>
     </w:tblStylePr>
   </w:style>
-  <w:style w:type="table" w:styleId="821">
+  <w:style w:type="table" w:styleId="835">
     <w:name w:val="Bordered - Accent 5"/>
-    <w:basedOn w:val="882"/>
+    <w:basedOn w:val="896"/>
     <w:uiPriority w:val="99"/>
     <w:pPr>
       <w:pBdr/>
@@ -31167,9 +31165,9 @@
       </w:tcPr>
     </w:tblStylePr>
   </w:style>
-  <w:style w:type="table" w:styleId="822">
+  <w:style w:type="table" w:styleId="836">
     <w:name w:val="Bordered - Accent 6"/>
-    <w:basedOn w:val="882"/>
+    <w:basedOn w:val="896"/>
     <w:uiPriority w:val="99"/>
     <w:pPr>
       <w:pBdr/>
@@ -31398,11 +31396,11 @@
       </w:tcPr>
     </w:tblStylePr>
   </w:style>
-  <w:style w:type="paragraph" w:styleId="823">
+  <w:style w:type="paragraph" w:styleId="837">
     <w:name w:val="Heading 1"/>
-    <w:basedOn w:val="881"/>
-    <w:next w:val="881"/>
-    <w:link w:val="833"/>
+    <w:basedOn w:val="895"/>
+    <w:next w:val="895"/>
+    <w:link w:val="847"/>
     <w:uiPriority w:val="9"/>
     <w:qFormat/>
     <w:pPr>
@@ -31420,11 +31418,11 @@
       <w:szCs w:val="40"/>
     </w:rPr>
   </w:style>
-  <w:style w:type="paragraph" w:styleId="824">
+  <w:style w:type="paragraph" w:styleId="838">
     <w:name w:val="Heading 2"/>
-    <w:basedOn w:val="881"/>
-    <w:next w:val="881"/>
-    <w:link w:val="834"/>
+    <w:basedOn w:val="895"/>
+    <w:next w:val="895"/>
+    <w:link w:val="848"/>
     <w:uiPriority w:val="9"/>
     <w:unhideWhenUsed/>
     <w:qFormat/>
@@ -31443,11 +31441,11 @@
       <w:szCs w:val="32"/>
     </w:rPr>
   </w:style>
-  <w:style w:type="paragraph" w:styleId="825">
+  <w:style w:type="paragraph" w:styleId="839">
     <w:name w:val="Heading 3"/>
-    <w:basedOn w:val="881"/>
-    <w:next w:val="881"/>
-    <w:link w:val="835"/>
+    <w:basedOn w:val="895"/>
+    <w:next w:val="895"/>
+    <w:link w:val="849"/>
     <w:uiPriority w:val="9"/>
     <w:unhideWhenUsed/>
     <w:qFormat/>
@@ -31466,11 +31464,11 @@
       <w:szCs w:val="28"/>
     </w:rPr>
   </w:style>
-  <w:style w:type="paragraph" w:styleId="826">
+  <w:style w:type="paragraph" w:styleId="840">
     <w:name w:val="Heading 4"/>
-    <w:basedOn w:val="881"/>
-    <w:next w:val="881"/>
-    <w:link w:val="836"/>
+    <w:basedOn w:val="895"/>
+    <w:next w:val="895"/>
+    <w:link w:val="850"/>
     <w:uiPriority w:val="9"/>
     <w:unhideWhenUsed/>
     <w:qFormat/>
@@ -31489,11 +31487,11 @@
       <w:color w:val="0f4761" w:themeColor="accent1" w:themeShade="BF"/>
     </w:rPr>
   </w:style>
-  <w:style w:type="paragraph" w:styleId="827">
+  <w:style w:type="paragraph" w:styleId="841">
     <w:name w:val="Heading 5"/>
-    <w:basedOn w:val="881"/>
-    <w:next w:val="881"/>
-    <w:link w:val="837"/>
+    <w:basedOn w:val="895"/>
+    <w:next w:val="895"/>
+    <w:link w:val="851"/>
     <w:uiPriority w:val="9"/>
     <w:unhideWhenUsed/>
     <w:qFormat/>
@@ -31510,11 +31508,11 @@
       <w:color w:val="0f4761" w:themeColor="accent1" w:themeShade="BF"/>
     </w:rPr>
   </w:style>
-  <w:style w:type="paragraph" w:styleId="828">
+  <w:style w:type="paragraph" w:styleId="842">
     <w:name w:val="Heading 6"/>
-    <w:basedOn w:val="881"/>
-    <w:next w:val="881"/>
-    <w:link w:val="838"/>
+    <w:basedOn w:val="895"/>
+    <w:next w:val="895"/>
+    <w:link w:val="852"/>
     <w:uiPriority w:val="9"/>
     <w:unhideWhenUsed/>
     <w:qFormat/>
@@ -31533,11 +31531,11 @@
       <w:color w:val="595959" w:themeColor="text1" w:themeTint="A6"/>
     </w:rPr>
   </w:style>
-  <w:style w:type="paragraph" w:styleId="829">
+  <w:style w:type="paragraph" w:styleId="843">
     <w:name w:val="Heading 7"/>
-    <w:basedOn w:val="881"/>
-    <w:next w:val="881"/>
-    <w:link w:val="839"/>
+    <w:basedOn w:val="895"/>
+    <w:next w:val="895"/>
+    <w:link w:val="853"/>
     <w:uiPriority w:val="9"/>
     <w:unhideWhenUsed/>
     <w:qFormat/>
@@ -31554,11 +31552,11 @@
       <w:color w:val="595959" w:themeColor="text1" w:themeTint="A6"/>
     </w:rPr>
   </w:style>
-  <w:style w:type="paragraph" w:styleId="830">
+  <w:style w:type="paragraph" w:styleId="844">
     <w:name w:val="Heading 8"/>
-    <w:basedOn w:val="881"/>
-    <w:next w:val="881"/>
-    <w:link w:val="840"/>
+    <w:basedOn w:val="895"/>
+    <w:next w:val="895"/>
+    <w:link w:val="854"/>
     <w:uiPriority w:val="9"/>
     <w:unhideWhenUsed/>
     <w:qFormat/>
@@ -31577,11 +31575,11 @@
       <w:color w:val="272727" w:themeColor="text1" w:themeTint="D8"/>
     </w:rPr>
   </w:style>
-  <w:style w:type="paragraph" w:styleId="831">
+  <w:style w:type="paragraph" w:styleId="845">
     <w:name w:val="Heading 9"/>
-    <w:basedOn w:val="881"/>
-    <w:next w:val="881"/>
-    <w:link w:val="841"/>
+    <w:basedOn w:val="895"/>
+    <w:next w:val="895"/>
+    <w:link w:val="855"/>
     <w:uiPriority w:val="9"/>
     <w:unhideWhenUsed/>
     <w:qFormat/>
@@ -31600,7 +31598,7 @@
       <w:color w:val="272727" w:themeColor="text1" w:themeTint="D8"/>
     </w:rPr>
   </w:style>
-  <w:style w:type="character" w:styleId="832" w:default="1">
+  <w:style w:type="character" w:styleId="846" w:default="1">
     <w:name w:val="Default Paragraph Font"/>
     <w:uiPriority w:val="1"/>
     <w:semiHidden/>
@@ -31611,10 +31609,10 @@
       <w:ind/>
     </w:pPr>
   </w:style>
-  <w:style w:type="character" w:styleId="833">
+  <w:style w:type="character" w:styleId="847">
     <w:name w:val="Heading 1 Char"/>
-    <w:basedOn w:val="832"/>
-    <w:link w:val="823"/>
+    <w:basedOn w:val="846"/>
+    <w:link w:val="837"/>
     <w:uiPriority w:val="9"/>
     <w:pPr>
       <w:pBdr/>
@@ -31628,10 +31626,10 @@
       <w:szCs w:val="40"/>
     </w:rPr>
   </w:style>
-  <w:style w:type="character" w:styleId="834">
+  <w:style w:type="character" w:styleId="848">
     <w:name w:val="Heading 2 Char"/>
-    <w:basedOn w:val="832"/>
-    <w:link w:val="824"/>
+    <w:basedOn w:val="846"/>
+    <w:link w:val="838"/>
     <w:uiPriority w:val="9"/>
     <w:pPr>
       <w:pBdr/>
@@ -31645,10 +31643,10 @@
       <w:szCs w:val="32"/>
     </w:rPr>
   </w:style>
-  <w:style w:type="character" w:styleId="835">
+  <w:style w:type="character" w:styleId="849">
     <w:name w:val="Heading 3 Char"/>
-    <w:basedOn w:val="832"/>
-    <w:link w:val="825"/>
+    <w:basedOn w:val="846"/>
+    <w:link w:val="839"/>
     <w:uiPriority w:val="9"/>
     <w:pPr>
       <w:pBdr/>
@@ -31662,10 +31660,10 @@
       <w:szCs w:val="28"/>
     </w:rPr>
   </w:style>
-  <w:style w:type="character" w:styleId="836">
+  <w:style w:type="character" w:styleId="850">
     <w:name w:val="Heading 4 Char"/>
-    <w:basedOn w:val="832"/>
-    <w:link w:val="826"/>
+    <w:basedOn w:val="846"/>
+    <w:link w:val="840"/>
     <w:uiPriority w:val="9"/>
     <w:pPr>
       <w:pBdr/>
@@ -31679,10 +31677,10 @@
       <w:color w:val="0f4761" w:themeColor="accent1" w:themeShade="BF"/>
     </w:rPr>
   </w:style>
-  <w:style w:type="character" w:styleId="837">
+  <w:style w:type="character" w:styleId="851">
     <w:name w:val="Heading 5 Char"/>
-    <w:basedOn w:val="832"/>
-    <w:link w:val="827"/>
+    <w:basedOn w:val="846"/>
+    <w:link w:val="841"/>
     <w:uiPriority w:val="9"/>
     <w:pPr>
       <w:pBdr/>
@@ -31694,10 +31692,10 @@
       <w:color w:val="0f4761" w:themeColor="accent1" w:themeShade="BF"/>
     </w:rPr>
   </w:style>
-  <w:style w:type="character" w:styleId="838">
+  <w:style w:type="character" w:styleId="852">
     <w:name w:val="Heading 6 Char"/>
-    <w:basedOn w:val="832"/>
-    <w:link w:val="828"/>
+    <w:basedOn w:val="846"/>
+    <w:link w:val="842"/>
     <w:uiPriority w:val="9"/>
     <w:pPr>
       <w:pBdr/>
@@ -31711,10 +31709,10 @@
       <w:color w:val="595959" w:themeColor="text1" w:themeTint="A6"/>
     </w:rPr>
   </w:style>
-  <w:style w:type="character" w:styleId="839">
+  <w:style w:type="character" w:styleId="853">
     <w:name w:val="Heading 7 Char"/>
-    <w:basedOn w:val="832"/>
-    <w:link w:val="829"/>
+    <w:basedOn w:val="846"/>
+    <w:link w:val="843"/>
     <w:uiPriority w:val="9"/>
     <w:pPr>
       <w:pBdr/>
@@ -31726,10 +31724,10 @@
       <w:color w:val="595959" w:themeColor="text1" w:themeTint="A6"/>
     </w:rPr>
   </w:style>
-  <w:style w:type="character" w:styleId="840">
+  <w:style w:type="character" w:styleId="854">
     <w:name w:val="Heading 8 Char"/>
-    <w:basedOn w:val="832"/>
-    <w:link w:val="830"/>
+    <w:basedOn w:val="846"/>
+    <w:link w:val="844"/>
     <w:uiPriority w:val="9"/>
     <w:pPr>
       <w:pBdr/>
@@ -31743,10 +31741,10 @@
       <w:color w:val="272727" w:themeColor="text1" w:themeTint="D8"/>
     </w:rPr>
   </w:style>
-  <w:style w:type="character" w:styleId="841">
+  <w:style w:type="character" w:styleId="855">
     <w:name w:val="Heading 9 Char"/>
-    <w:basedOn w:val="832"/>
-    <w:link w:val="831"/>
+    <w:basedOn w:val="846"/>
+    <w:link w:val="845"/>
     <w:uiPriority w:val="9"/>
     <w:pPr>
       <w:pBdr/>
@@ -31760,11 +31758,11 @@
       <w:color w:val="272727" w:themeColor="text1" w:themeTint="D8"/>
     </w:rPr>
   </w:style>
-  <w:style w:type="paragraph" w:styleId="842">
+  <w:style w:type="paragraph" w:styleId="856">
     <w:name w:val="Title"/>
-    <w:basedOn w:val="881"/>
-    <w:next w:val="881"/>
-    <w:link w:val="843"/>
+    <w:basedOn w:val="895"/>
+    <w:next w:val="895"/>
+    <w:link w:val="857"/>
     <w:uiPriority w:val="10"/>
     <w:qFormat/>
     <w:pPr>
@@ -31780,10 +31778,10 @@
       <w:szCs w:val="56"/>
     </w:rPr>
   </w:style>
-  <w:style w:type="character" w:styleId="843">
+  <w:style w:type="character" w:styleId="857">
     <w:name w:val="Title Char"/>
-    <w:basedOn w:val="832"/>
-    <w:link w:val="842"/>
+    <w:basedOn w:val="846"/>
+    <w:link w:val="856"/>
     <w:uiPriority w:val="10"/>
     <w:pPr>
       <w:pBdr/>
@@ -31797,11 +31795,11 @@
       <w:szCs w:val="56"/>
     </w:rPr>
   </w:style>
-  <w:style w:type="paragraph" w:styleId="844">
+  <w:style w:type="paragraph" w:styleId="858">
     <w:name w:val="Subtitle"/>
-    <w:basedOn w:val="881"/>
-    <w:next w:val="881"/>
-    <w:link w:val="845"/>
+    <w:basedOn w:val="895"/>
+    <w:next w:val="895"/>
+    <w:link w:val="859"/>
     <w:uiPriority w:val="11"/>
     <w:qFormat/>
     <w:pPr>
@@ -31819,10 +31817,10 @@
       <w:szCs w:val="28"/>
     </w:rPr>
   </w:style>
-  <w:style w:type="character" w:styleId="845">
+  <w:style w:type="character" w:styleId="859">
     <w:name w:val="Subtitle Char"/>
-    <w:basedOn w:val="832"/>
-    <w:link w:val="844"/>
+    <w:basedOn w:val="846"/>
+    <w:link w:val="858"/>
     <w:uiPriority w:val="11"/>
     <w:pPr>
       <w:pBdr/>
@@ -31836,11 +31834,11 @@
       <w:szCs w:val="28"/>
     </w:rPr>
   </w:style>
-  <w:style w:type="paragraph" w:styleId="846">
+  <w:style w:type="paragraph" w:styleId="860">
     <w:name w:val="Quote"/>
-    <w:basedOn w:val="881"/>
-    <w:next w:val="881"/>
-    <w:link w:val="847"/>
+    <w:basedOn w:val="895"/>
+    <w:next w:val="895"/>
+    <w:link w:val="861"/>
     <w:uiPriority w:val="29"/>
     <w:qFormat/>
     <w:pPr>
@@ -31855,10 +31853,10 @@
       <w:color w:val="404040" w:themeColor="text1" w:themeTint="BF"/>
     </w:rPr>
   </w:style>
-  <w:style w:type="character" w:styleId="847">
+  <w:style w:type="character" w:styleId="861">
     <w:name w:val="Quote Char"/>
-    <w:basedOn w:val="832"/>
-    <w:link w:val="846"/>
+    <w:basedOn w:val="846"/>
+    <w:link w:val="860"/>
     <w:uiPriority w:val="29"/>
     <w:pPr>
       <w:pBdr/>
@@ -31871,9 +31869,9 @@
       <w:color w:val="404040" w:themeColor="text1" w:themeTint="BF"/>
     </w:rPr>
   </w:style>
-  <w:style w:type="character" w:styleId="848">
+  <w:style w:type="character" w:styleId="862">
     <w:name w:val="Intense Emphasis"/>
-    <w:basedOn w:val="832"/>
+    <w:basedOn w:val="846"/>
     <w:uiPriority w:val="21"/>
     <w:qFormat/>
     <w:pPr>
@@ -31887,11 +31885,11 @@
       <w:color w:val="0f4761" w:themeColor="accent1" w:themeShade="BF"/>
     </w:rPr>
   </w:style>
-  <w:style w:type="paragraph" w:styleId="849">
+  <w:style w:type="paragraph" w:styleId="863">
     <w:name w:val="Intense Quote"/>
-    <w:basedOn w:val="881"/>
-    <w:next w:val="881"/>
-    <w:link w:val="850"/>
+    <w:basedOn w:val="895"/>
+    <w:next w:val="895"/>
+    <w:link w:val="864"/>
     <w:uiPriority w:val="30"/>
     <w:qFormat/>
     <w:pPr>
@@ -31909,10 +31907,10 @@
       <w:color w:val="0f4761" w:themeColor="accent1" w:themeShade="BF"/>
     </w:rPr>
   </w:style>
-  <w:style w:type="character" w:styleId="850">
+  <w:style w:type="character" w:styleId="864">
     <w:name w:val="Intense Quote Char"/>
-    <w:basedOn w:val="832"/>
-    <w:link w:val="849"/>
+    <w:basedOn w:val="846"/>
+    <w:link w:val="863"/>
     <w:uiPriority w:val="30"/>
     <w:pPr>
       <w:pBdr/>
@@ -31925,9 +31923,9 @@
       <w:color w:val="0f4761" w:themeColor="accent1" w:themeShade="BF"/>
     </w:rPr>
   </w:style>
-  <w:style w:type="character" w:styleId="851">
+  <w:style w:type="character" w:styleId="865">
     <w:name w:val="Intense Reference"/>
-    <w:basedOn w:val="832"/>
+    <w:basedOn w:val="846"/>
     <w:uiPriority w:val="32"/>
     <w:qFormat/>
     <w:pPr>
@@ -31943,9 +31941,9 @@
       <w:spacing w:val="5"/>
     </w:rPr>
   </w:style>
-  <w:style w:type="character" w:styleId="852">
+  <w:style w:type="character" w:styleId="866">
     <w:name w:val="Subtle Emphasis"/>
-    <w:basedOn w:val="832"/>
+    <w:basedOn w:val="846"/>
     <w:uiPriority w:val="19"/>
     <w:qFormat/>
     <w:pPr>
@@ -31959,9 +31957,9 @@
       <w:color w:val="404040" w:themeColor="text1" w:themeTint="BF"/>
     </w:rPr>
   </w:style>
-  <w:style w:type="character" w:styleId="853">
+  <w:style w:type="character" w:styleId="867">
     <w:name w:val="Emphasis"/>
-    <w:basedOn w:val="832"/>
+    <w:basedOn w:val="846"/>
     <w:uiPriority w:val="20"/>
     <w:qFormat/>
     <w:pPr>
@@ -31974,9 +31972,9 @@
       <w:iCs/>
     </w:rPr>
   </w:style>
-  <w:style w:type="character" w:styleId="854">
+  <w:style w:type="character" w:styleId="868">
     <w:name w:val="Strong"/>
-    <w:basedOn w:val="832"/>
+    <w:basedOn w:val="846"/>
     <w:uiPriority w:val="22"/>
     <w:qFormat/>
     <w:pPr>
@@ -31989,9 +31987,9 @@
       <w:bCs/>
     </w:rPr>
   </w:style>
-  <w:style w:type="character" w:styleId="855">
+  <w:style w:type="character" w:styleId="869">
     <w:name w:val="Subtle Reference"/>
-    <w:basedOn w:val="832"/>
+    <w:basedOn w:val="846"/>
     <w:uiPriority w:val="31"/>
     <w:qFormat/>
     <w:pPr>
@@ -32004,9 +32002,9 @@
       <w:color w:val="5a5a5a" w:themeColor="text1" w:themeTint="A5"/>
     </w:rPr>
   </w:style>
-  <w:style w:type="character" w:styleId="856">
+  <w:style w:type="character" w:styleId="870">
     <w:name w:val="Book Title"/>
-    <w:basedOn w:val="832"/>
+    <w:basedOn w:val="846"/>
     <w:uiPriority w:val="33"/>
     <w:qFormat/>
     <w:pPr>
@@ -32022,10 +32020,10 @@
       <w:spacing w:val="5"/>
     </w:rPr>
   </w:style>
-  <w:style w:type="paragraph" w:styleId="857">
+  <w:style w:type="paragraph" w:styleId="871">
     <w:name w:val="Header"/>
-    <w:basedOn w:val="881"/>
-    <w:link w:val="858"/>
+    <w:basedOn w:val="895"/>
+    <w:link w:val="872"/>
     <w:uiPriority w:val="99"/>
     <w:unhideWhenUsed/>
     <w:pPr>
@@ -32038,10 +32036,10 @@
       <w:ind/>
     </w:pPr>
   </w:style>
-  <w:style w:type="character" w:styleId="858">
+  <w:style w:type="character" w:styleId="872">
     <w:name w:val="Header Char"/>
-    <w:basedOn w:val="832"/>
-    <w:link w:val="857"/>
+    <w:basedOn w:val="846"/>
+    <w:link w:val="871"/>
     <w:uiPriority w:val="99"/>
     <w:pPr>
       <w:pBdr/>
@@ -32049,10 +32047,10 @@
       <w:ind/>
     </w:pPr>
   </w:style>
-  <w:style w:type="paragraph" w:styleId="859">
+  <w:style w:type="paragraph" w:styleId="873">
     <w:name w:val="Footer"/>
-    <w:basedOn w:val="881"/>
-    <w:link w:val="860"/>
+    <w:basedOn w:val="895"/>
+    <w:link w:val="874"/>
     <w:uiPriority w:val="99"/>
     <w:unhideWhenUsed/>
     <w:pPr>
@@ -32065,10 +32063,10 @@
       <w:ind/>
     </w:pPr>
   </w:style>
-  <w:style w:type="character" w:styleId="860">
+  <w:style w:type="character" w:styleId="874">
     <w:name w:val="Footer Char"/>
-    <w:basedOn w:val="832"/>
-    <w:link w:val="859"/>
+    <w:basedOn w:val="846"/>
+    <w:link w:val="873"/>
     <w:uiPriority w:val="99"/>
     <w:pPr>
       <w:pBdr/>
@@ -32076,10 +32074,10 @@
       <w:ind/>
     </w:pPr>
   </w:style>
-  <w:style w:type="paragraph" w:styleId="861">
+  <w:style w:type="paragraph" w:styleId="875">
     <w:name w:val="Caption"/>
-    <w:basedOn w:val="881"/>
-    <w:next w:val="881"/>
+    <w:basedOn w:val="895"/>
+    <w:next w:val="895"/>
     <w:uiPriority w:val="35"/>
     <w:unhideWhenUsed/>
     <w:qFormat/>
@@ -32096,10 +32094,10 @@
       <w:szCs w:val="18"/>
     </w:rPr>
   </w:style>
-  <w:style w:type="paragraph" w:styleId="862">
+  <w:style w:type="paragraph" w:styleId="876">
     <w:name w:val="footnote text"/>
-    <w:basedOn w:val="881"/>
-    <w:link w:val="863"/>
+    <w:basedOn w:val="895"/>
+    <w:link w:val="877"/>
     <w:uiPriority w:val="99"/>
     <w:semiHidden/>
     <w:unhideWhenUsed/>
@@ -32113,10 +32111,10 @@
       <w:szCs w:val="20"/>
     </w:rPr>
   </w:style>
-  <w:style w:type="character" w:styleId="863">
+  <w:style w:type="character" w:styleId="877">
     <w:name w:val="Footnote Text Char"/>
-    <w:basedOn w:val="832"/>
-    <w:link w:val="862"/>
+    <w:basedOn w:val="846"/>
+    <w:link w:val="876"/>
     <w:uiPriority w:val="99"/>
     <w:semiHidden/>
     <w:pPr>
@@ -32129,9 +32127,9 @@
       <w:szCs w:val="20"/>
     </w:rPr>
   </w:style>
-  <w:style w:type="character" w:styleId="864">
+  <w:style w:type="character" w:styleId="878">
     <w:name w:val="footnote reference"/>
-    <w:basedOn w:val="832"/>
+    <w:basedOn w:val="846"/>
     <w:uiPriority w:val="99"/>
     <w:semiHidden/>
     <w:unhideWhenUsed/>
@@ -32144,10 +32142,10 @@
       <w:vertAlign w:val="superscript"/>
     </w:rPr>
   </w:style>
-  <w:style w:type="paragraph" w:styleId="865">
+  <w:style w:type="paragraph" w:styleId="879">
     <w:name w:val="endnote text"/>
-    <w:basedOn w:val="881"/>
-    <w:link w:val="866"/>
+    <w:basedOn w:val="895"/>
+    <w:link w:val="880"/>
     <w:uiPriority w:val="99"/>
     <w:semiHidden/>
     <w:unhideWhenUsed/>
@@ -32161,10 +32159,10 @@
       <w:szCs w:val="20"/>
     </w:rPr>
   </w:style>
-  <w:style w:type="character" w:styleId="866">
+  <w:style w:type="character" w:styleId="880">
     <w:name w:val="Endnote Text Char"/>
-    <w:basedOn w:val="832"/>
-    <w:link w:val="865"/>
+    <w:basedOn w:val="846"/>
+    <w:link w:val="879"/>
     <w:uiPriority w:val="99"/>
     <w:semiHidden/>
     <w:pPr>
@@ -32177,9 +32175,9 @@
       <w:szCs w:val="20"/>
     </w:rPr>
   </w:style>
-  <w:style w:type="character" w:styleId="867">
+  <w:style w:type="character" w:styleId="881">
     <w:name w:val="endnote reference"/>
-    <w:basedOn w:val="832"/>
+    <w:basedOn w:val="846"/>
     <w:uiPriority w:val="99"/>
     <w:semiHidden/>
     <w:unhideWhenUsed/>
@@ -32192,9 +32190,9 @@
       <w:vertAlign w:val="superscript"/>
     </w:rPr>
   </w:style>
-  <w:style w:type="character" w:styleId="868">
+  <w:style w:type="character" w:styleId="882">
     <w:name w:val="Hyperlink"/>
-    <w:basedOn w:val="832"/>
+    <w:basedOn w:val="846"/>
     <w:uiPriority w:val="99"/>
     <w:unhideWhenUsed/>
     <w:pPr>
@@ -32207,9 +32205,9 @@
       <w:u w:val="single"/>
     </w:rPr>
   </w:style>
-  <w:style w:type="character" w:styleId="869">
+  <w:style w:type="character" w:styleId="883">
     <w:name w:val="FollowedHyperlink"/>
-    <w:basedOn w:val="832"/>
+    <w:basedOn w:val="846"/>
     <w:uiPriority w:val="99"/>
     <w:semiHidden/>
     <w:unhideWhenUsed/>
@@ -32223,10 +32221,10 @@
       <w:u w:val="single"/>
     </w:rPr>
   </w:style>
-  <w:style w:type="paragraph" w:styleId="870">
+  <w:style w:type="paragraph" w:styleId="884">
     <w:name w:val="toc 1"/>
-    <w:basedOn w:val="881"/>
-    <w:next w:val="881"/>
+    <w:basedOn w:val="895"/>
+    <w:next w:val="895"/>
     <w:uiPriority w:val="39"/>
     <w:unhideWhenUsed/>
     <w:pPr>
@@ -32235,10 +32233,10 @@
       <w:ind/>
     </w:pPr>
   </w:style>
-  <w:style w:type="paragraph" w:styleId="871">
+  <w:style w:type="paragraph" w:styleId="885">
     <w:name w:val="toc 2"/>
-    <w:basedOn w:val="881"/>
-    <w:next w:val="881"/>
+    <w:basedOn w:val="895"/>
+    <w:next w:val="895"/>
     <w:uiPriority w:val="39"/>
     <w:unhideWhenUsed/>
     <w:pPr>
@@ -32247,10 +32245,10 @@
       <w:ind w:left="220"/>
     </w:pPr>
   </w:style>
-  <w:style w:type="paragraph" w:styleId="872">
+  <w:style w:type="paragraph" w:styleId="886">
     <w:name w:val="toc 3"/>
-    <w:basedOn w:val="881"/>
-    <w:next w:val="881"/>
+    <w:basedOn w:val="895"/>
+    <w:next w:val="895"/>
     <w:uiPriority w:val="39"/>
     <w:unhideWhenUsed/>
     <w:pPr>
@@ -32259,10 +32257,10 @@
       <w:ind w:left="440"/>
     </w:pPr>
   </w:style>
-  <w:style w:type="paragraph" w:styleId="873">
+  <w:style w:type="paragraph" w:styleId="887">
     <w:name w:val="toc 4"/>
-    <w:basedOn w:val="881"/>
-    <w:next w:val="881"/>
+    <w:basedOn w:val="895"/>
+    <w:next w:val="895"/>
     <w:uiPriority w:val="39"/>
     <w:unhideWhenUsed/>
     <w:pPr>
@@ -32271,10 +32269,10 @@
       <w:ind w:left="660"/>
     </w:pPr>
   </w:style>
-  <w:style w:type="paragraph" w:styleId="874">
+  <w:style w:type="paragraph" w:styleId="888">
     <w:name w:val="toc 5"/>
-    <w:basedOn w:val="881"/>
-    <w:next w:val="881"/>
+    <w:basedOn w:val="895"/>
+    <w:next w:val="895"/>
     <w:uiPriority w:val="39"/>
     <w:unhideWhenUsed/>
     <w:pPr>
@@ -32283,10 +32281,10 @@
       <w:ind w:left="880"/>
     </w:pPr>
   </w:style>
-  <w:style w:type="paragraph" w:styleId="875">
+  <w:style w:type="paragraph" w:styleId="889">
     <w:name w:val="toc 6"/>
-    <w:basedOn w:val="881"/>
-    <w:next w:val="881"/>
+    <w:basedOn w:val="895"/>
+    <w:next w:val="895"/>
     <w:uiPriority w:val="39"/>
     <w:unhideWhenUsed/>
     <w:pPr>
@@ -32295,10 +32293,10 @@
       <w:ind w:left="1100"/>
     </w:pPr>
   </w:style>
-  <w:style w:type="paragraph" w:styleId="876">
+  <w:style w:type="paragraph" w:styleId="890">
     <w:name w:val="toc 7"/>
-    <w:basedOn w:val="881"/>
-    <w:next w:val="881"/>
+    <w:basedOn w:val="895"/>
+    <w:next w:val="895"/>
     <w:uiPriority w:val="39"/>
     <w:unhideWhenUsed/>
     <w:pPr>
@@ -32307,10 +32305,10 @@
       <w:ind w:left="1320"/>
     </w:pPr>
   </w:style>
-  <w:style w:type="paragraph" w:styleId="877">
+  <w:style w:type="paragraph" w:styleId="891">
     <w:name w:val="toc 8"/>
-    <w:basedOn w:val="881"/>
-    <w:next w:val="881"/>
+    <w:basedOn w:val="895"/>
+    <w:next w:val="895"/>
     <w:uiPriority w:val="39"/>
     <w:unhideWhenUsed/>
     <w:pPr>
@@ -32319,10 +32317,10 @@
       <w:ind w:left="1540"/>
     </w:pPr>
   </w:style>
-  <w:style w:type="paragraph" w:styleId="878">
+  <w:style w:type="paragraph" w:styleId="892">
     <w:name w:val="toc 9"/>
-    <w:basedOn w:val="881"/>
-    <w:next w:val="881"/>
+    <w:basedOn w:val="895"/>
+    <w:next w:val="895"/>
     <w:uiPriority w:val="39"/>
     <w:unhideWhenUsed/>
     <w:pPr>
@@ -32331,7 +32329,7 @@
       <w:ind w:left="1760"/>
     </w:pPr>
   </w:style>
-  <w:style w:type="paragraph" w:styleId="879">
+  <w:style w:type="paragraph" w:styleId="893">
     <w:name w:val="TOC Heading"/>
     <w:uiPriority w:val="39"/>
     <w:unhideWhenUsed/>
@@ -32341,10 +32339,10 @@
       <w:ind/>
     </w:pPr>
   </w:style>
-  <w:style w:type="paragraph" w:styleId="880">
+  <w:style w:type="paragraph" w:styleId="894">
     <w:name w:val="table of figures"/>
-    <w:basedOn w:val="881"/>
-    <w:next w:val="881"/>
+    <w:basedOn w:val="895"/>
+    <w:next w:val="895"/>
     <w:uiPriority w:val="99"/>
     <w:unhideWhenUsed/>
     <w:pPr>
@@ -32353,7 +32351,7 @@
       <w:ind/>
     </w:pPr>
   </w:style>
-  <w:style w:type="paragraph" w:styleId="881" w:default="1">
+  <w:style w:type="paragraph" w:styleId="895" w:default="1">
     <w:name w:val="Normal"/>
     <w:qFormat/>
     <w:pPr>
@@ -32362,7 +32360,7 @@
       <w:ind/>
     </w:pPr>
   </w:style>
-  <w:style w:type="table" w:styleId="882" w:default="1">
+  <w:style w:type="table" w:styleId="896" w:default="1">
     <w:name w:val="Normal Table"/>
     <w:uiPriority w:val="99"/>
     <w:semiHidden/>
@@ -32555,7 +32553,7 @@
       </w:tcPr>
     </w:tblStylePr>
   </w:style>
-  <w:style w:type="numbering" w:styleId="883" w:default="1">
+  <w:style w:type="numbering" w:styleId="897" w:default="1">
     <w:name w:val="No List"/>
     <w:uiPriority w:val="99"/>
     <w:semiHidden/>
@@ -32566,9 +32564,9 @@
       <w:ind/>
     </w:pPr>
   </w:style>
-  <w:style w:type="paragraph" w:styleId="884">
+  <w:style w:type="paragraph" w:styleId="898">
     <w:name w:val="No Spacing"/>
-    <w:basedOn w:val="881"/>
+    <w:basedOn w:val="895"/>
     <w:uiPriority w:val="1"/>
     <w:qFormat/>
     <w:pPr>
@@ -32577,9 +32575,9 @@
       <w:ind/>
     </w:pPr>
   </w:style>
-  <w:style w:type="paragraph" w:styleId="885">
+  <w:style w:type="paragraph" w:styleId="899">
     <w:name w:val="List Paragraph"/>
-    <w:basedOn w:val="881"/>
+    <w:basedOn w:val="895"/>
     <w:uiPriority w:val="34"/>
     <w:qFormat/>
     <w:pPr>

</xml_diff>